<commit_message>
docs: finalize FMEA math, hardware grounding, pedestrian kinematics, protocol power, and section IX structure
</commit_message>
<xml_diff>
--- a/paper/manuscript_revised.docx
+++ b/paper/manuscript_revised.docx
@@ -164,7 +164,7 @@
           <w:rFonts w:ascii="Times New Roman" w:hAnsi="Times New Roman"/>
           <w:sz w:val="20"/>
         </w:rPr>
-        <w:t xml:space="preserve"> ROI max-pooling) achieves 100% synthetic hazard recall with zero delay, but on continuous video, localized hand and tool manipulation in peripheral cells increases trigger rates (80.5% suppression), saturating edge GPU queues at 100% duty cycle (11.50 W, projected 2.83 h runtime). Exploratory 1080p video evaluation and live Florence-2 FP16 profiling confirm queue saturation dynamics. We provide a 10-mode structured FMEA risk ledger, an architectural trade-off analysis with WorldScribe, and a 24-participant protocol pending IRB approval.</w:t>
+        <w:t xml:space="preserve"> ROI max-pooling) achieves 100% synthetic hazard recall with zero delay, but on continuous video, localized hand and tool manipulation in peripheral cells increases trigger rates (80.5% suppression), saturating edge GPU queues at 100% duty cycle (11.50 W, projected 2.83 h runtime). Exploratory 1080p video evaluation and live Florence-2 FP16 profiling confirm queue saturation dynamics. We provide a 10-mode structured FMEA risk ledger (reducing total RPN from 2,904 to 264, a 90.9% reduction), an architectural trade-off analysis with WorldScribe, and a 24-participant protocol pending IRB approval.</w:t>
       </w:r>
     </w:p>
     <w:p>
@@ -295,7 +295,7 @@
           <w:rFonts w:ascii="Times New Roman" w:hAnsi="Times New Roman"/>
           <w:sz w:val="20"/>
         </w:rPr>
-        <w:t xml:space="preserve">) and global color-appearance differencing—achieves high redundancy suppression (94.7%) on real egocentric video of technician benchwork, reducing modeled power draw to 7.52 W. However, global spatial averaging renders the gate blind to small, localized hazards (e.g., an approaching bicycle or curb) that occupy only a fraction of the visual field (resulting in 0% recall on localized hazard scenarios). Conversely, integrating high-sensitivity spatial </w:t>
+        <w:t xml:space="preserve">) and global color-appearance differencing—achieves high redundancy suppression (94.7%) on real egocentric video of technician benchwork, reducing modeled power draw to 7.52 W. However, global spatial averaging renders the gate blind to small, localized hazards (e.g., an approaching vehicle, bicycle, or curb) that occupy only a fraction of the visual field (resulting in 0% recall on localized hazard scenarios). Conversely, integrating high-sensitivity spatial </w:t>
       </w:r>
       <m:oMath>
         <m:r>
@@ -973,7 +973,7 @@
           <w:rFonts w:ascii="Times New Roman" w:hAnsi="Times New Roman"/>
           <w:sz w:val="20"/>
         </w:rPr>
-        <w:t>5) Architectural Trade-Off Analysis with WorldScribe (ACM UIST 2024): We present an architectural synthesis comparing SightLine's edge-native pipeline against WorldScribe [15] (Chang, Liu, and Guo), demonstrating that SightLine can serve as an upstream edge filter that eliminates redundant cloud egress bandwidth while providing an offline safety watchdog.</w:t>
+        <w:t>5) Architectural Trade-Off Analysis with WorldScribe (ACM UIST 2024): We present an architectural synthesis comparing SightLine's edge-native pipeline against WorldScribe [15] (Chang, Liu, and Guo). While WorldScribe optimizes lexical depth by streaming video contexts to cloud foundation models, SightLine operates entirely on-device, eliminating network round-trip jitter, cellular dead-zone vulnerability, and subscription bandwidth costs. We further discuss how SightLine's lightweight CPU gate can conceptually serve as an upstream edge filter to eliminate redundant cloud egress in hybrid architectures.</w:t>
       </w:r>
     </w:p>
     <w:p>
@@ -986,7 +986,7 @@
           <w:rFonts w:ascii="Times New Roman" w:hAnsi="Times New Roman"/>
           <w:sz w:val="20"/>
         </w:rPr>
-        <w:t>6) Auditable Energy Accounting, FMEA Risk Ledger, and Proposed Accessibility Protocol: We formulate an auditable edge power model differentiating measured, modeled, and assumed quantities, construct a 10-mode structured FMEA risk ledger with residual risk analysis (mean RPN reduced from 278.2 to 31.4, an 88.7% reduction), and specify a 24-participant BLV evaluation protocol currently submitted for IRB approval.</w:t>
+        <w:t>6) Auditable Energy Accounting, FMEA Risk Ledger, and Proposed Accessibility Protocol: We formulate an auditable edge power model differentiating measured, modeled, and assumed quantities, construct a 10-mode structured FMEA risk ledger with residual risk analysis (mean RPN reduced from 290.4 to 26.4, a 90.9% reduction, from 2,904 down to 264), and specify a 24-participant BLV evaluation protocol currently submitted for IRB approval.</w:t>
       </w:r>
     </w:p>
     <w:p>
@@ -6139,7 +6139,7 @@
           <w:rFonts w:ascii="Times New Roman" w:hAnsi="Times New Roman"/>
           <w:sz w:val="20"/>
         </w:rPr>
-        <w:t>When the foundation model executes, detections are inspected against a curated vocabulary of safety-critical hazards:</w:t>
+        <w:t>When the foundation model executes, detections are inspected against a curated vocabulary of physical collision hazards:</w:t>
       </w:r>
     </w:p>
     <w:tbl>
@@ -6191,7 +6191,7 @@
                 <m:rPr>
                   <m:nor/>
                 </m:rPr>
-                <m:t>'car', 'vehicle', 'truck', 'bus', 'bicycle', 'motorcycle', 'scooter', 'pedestrian', 'person', 'stairs', 'curb', 'hole', 'obstacle'</m:t>
+                <m:t>'car', 'vehicle', 'truck', 'bus', 'bicycle', 'motorcycle', 'scooter', 'stairs', 'curb', 'hole', 'obstacle', 'pole'</m:t>
               </m:r>
               <m:r>
                 <m:t>}</m:t>
@@ -6235,13 +6235,37 @@
           <w:rFonts w:ascii="Times New Roman" w:hAnsi="Times New Roman"/>
           <w:sz w:val="20"/>
         </w:rPr>
-        <w:t xml:space="preserve">In open-vocabulary edge deployments, downstream VLM prompting (such as Florence-2 &lt;OD&gt; object detection or &lt;CAPTION_TO_PHRASE_GROUNDING&gt; directed toward collision obstacles and approaching transit) matches detected visual entities against </w:t>
+        <w:t>Scoping Hazard Persistence vs. Crowd Alert Storms: In assistive navigation, distinguishing dynamic physical collision hazards from ambient human bystanders is essential to avoid cognitive overload and system thrashing. If every visible person triggered hazard latching (</w:t>
       </w:r>
       <m:oMath>
         <m:sSub>
           <m:e>
             <m:r>
-              <m:t>V</m:t>
+              <m:t>z</m:t>
+            </m:r>
+          </m:e>
+          <m:sub>
+            <m:r>
+              <m:t>t</m:t>
+            </m:r>
+          </m:sub>
+        </m:sSub>
+        <m:r>
+          <m:t>=1</m:t>
+        </m:r>
+      </m:oMath>
+      <w:r>
+        <w:rPr>
+          <w:rFonts w:ascii="Times New Roman" w:hAnsi="Times New Roman"/>
+          <w:sz w:val="20"/>
+        </w:rPr>
+        <w:t xml:space="preserve">), any crowded urban sidewalk or indoor space would permanently force </w:t>
+      </w:r>
+      <m:oMath>
+        <m:sSub>
+          <m:e>
+            <m:r>
+              <m:t>T</m:t>
             </m:r>
           </m:e>
           <m:sub>
@@ -6249,17 +6273,173 @@
               <m:rPr>
                 <m:nor/>
               </m:rPr>
-              <m:t>haz</m:t>
+              <m:t>active</m:t>
             </m:r>
           </m:sub>
         </m:sSub>
+        <m:r>
+          <m:t>=6</m:t>
+        </m:r>
       </m:oMath>
       <w:r>
         <w:rPr>
           <w:rFonts w:ascii="Times New Roman" w:hAnsi="Times New Roman"/>
           <w:sz w:val="20"/>
         </w:rPr>
-        <w:t xml:space="preserve">. Generic obstacles (e.g., tripping hazards, sudden path obstructions) map directly to the 'obstacle' class or are classified into specific ground-surface categories ('stairs', 'curb', 'hole'), ensuring robust safety latch triggering across urban and indoor environments. Detections update the binary hazard state </w:t>
+        <w:t xml:space="preserve"> (</w:t>
+      </w:r>
+      <m:oMath>
+        <m:r>
+          <m:t>5.0</m:t>
+        </m:r>
+        <m:r>
+          <m:rPr>
+            <m:nor/>
+          </m:rPr>
+          <m:t> Hz</m:t>
+        </m:r>
+      </m:oMath>
+      <w:r>
+        <w:rPr>
+          <w:rFonts w:ascii="Times New Roman" w:hAnsi="Times New Roman"/>
+          <w:sz w:val="20"/>
+        </w:rPr>
+        <w:t xml:space="preserve">), exceeding the </w:t>
+      </w:r>
+      <m:oMath>
+        <m:r>
+          <m:t>2.63</m:t>
+        </m:r>
+        <m:r>
+          <m:rPr>
+            <m:nor/>
+          </m:rPr>
+          <m:t> Hz</m:t>
+        </m:r>
+      </m:oMath>
+      <w:r>
+        <w:rPr>
+          <w:rFonts w:ascii="Times New Roman" w:hAnsi="Times New Roman"/>
+          <w:sz w:val="20"/>
+        </w:rPr>
+        <w:t xml:space="preserve"> edge VLM throughput, saturating the GPU queue at 100% duty cycle, and triggering continuous speech preemption. Therefore, human entities ('person', 'pedestrian') detected by open-vocabulary grounding (e.g., Florence-2 &lt;OD&gt;) trigger safety hazard latching (</w:t>
+      </w:r>
+      <m:oMath>
+        <m:sSub>
+          <m:e>
+            <m:r>
+              <m:t>z</m:t>
+            </m:r>
+          </m:e>
+          <m:sub>
+            <m:r>
+              <m:t>t</m:t>
+            </m:r>
+          </m:sub>
+        </m:sSub>
+        <m:r>
+          <m:t>=1</m:t>
+        </m:r>
+      </m:oMath>
+      <w:r>
+        <w:rPr>
+          <w:rFonts w:ascii="Times New Roman" w:hAnsi="Times New Roman"/>
+          <w:sz w:val="20"/>
+        </w:rPr>
+        <w:t xml:space="preserve"> and </w:t>
+      </w:r>
+      <m:oMath>
+        <m:sSub>
+          <m:e>
+            <m:r>
+              <m:t>f</m:t>
+            </m:r>
+          </m:e>
+          <m:sub>
+            <m:r>
+              <m:t>1</m:t>
+            </m:r>
+          </m:sub>
+        </m:sSub>
+        <m:r>
+          <m:t>=1.0</m:t>
+        </m:r>
+      </m:oMath>
+      <w:r>
+        <w:rPr>
+          <w:rFonts w:ascii="Times New Roman" w:hAnsi="Times New Roman"/>
+          <w:sz w:val="20"/>
+        </w:rPr>
+        <w:t xml:space="preserve">) only when accompanied by close proximity (bounding box height fraction </w:t>
+      </w:r>
+      <m:oMath>
+        <m:r>
+          <m:t>&gt;0.40</m:t>
+        </m:r>
+      </m:oMath>
+      <w:r>
+        <w:rPr>
+          <w:rFonts w:ascii="Times New Roman" w:hAnsi="Times New Roman"/>
+          <w:sz w:val="20"/>
+        </w:rPr>
+        <w:t xml:space="preserve">, indicating </w:t>
+      </w:r>
+      <m:oMath>
+        <m:d>
+          <m:dPr>
+            <m:begChr m:val="&lt;"/>
+            <m:sepChr m:val=""/>
+            <m:endChr m:val=""/>
+          </m:dPr>
+          <m:e>
+            <m:r>
+              <m:t>2.5</m:t>
+            </m:r>
+            <m:r>
+              <m:rPr>
+                <m:nor/>
+              </m:rPr>
+              <m:t> m</m:t>
+            </m:r>
+          </m:e>
+        </m:d>
+      </m:oMath>
+      <w:r>
+        <w:rPr>
+          <w:rFonts w:ascii="Times New Roman" w:hAnsi="Times New Roman"/>
+          <w:sz w:val="20"/>
+        </w:rPr>
+        <w:t>) or approach trajectory (</w:t>
+      </w:r>
+      <m:oMath>
+        <m:sSub>
+          <m:e>
+            <m:r>
+              <m:t>v</m:t>
+            </m:r>
+          </m:e>
+          <m:sub>
+            <m:r>
+              <m:t>i</m:t>
+            </m:r>
+          </m:sub>
+        </m:sSub>
+        <m:r>
+          <m:t>≥1.0</m:t>
+        </m:r>
+        <m:r>
+          <m:rPr>
+            <m:nor/>
+          </m:rPr>
+          <m:t> m/s</m:t>
+        </m:r>
+      </m:oMath>
+      <w:r>
+        <w:rPr>
+          <w:rFonts w:ascii="Times New Roman" w:hAnsi="Times New Roman"/>
+          <w:sz w:val="20"/>
+        </w:rPr>
+        <w:t xml:space="preserve">), treating non-approaching bystanders as ambient visual entities. Detections update the binary hazard state </w:t>
       </w:r>
       <m:oMath>
         <m:sSub>
@@ -9146,7 +9326,7 @@
           <w:rFonts w:ascii="Times New Roman" w:hAnsi="Times New Roman"/>
           <w:sz w:val="20"/>
         </w:rPr>
-        <w:t>*In Quiescent Seated Rest, T_ambient is bounded to 150 frames (5.0 s) to preserve fail-safe hazard discovery. A pure periodic heartbeat of 1 probe per 150 frames yields 99.33% raw suppression (149/150 suppressed), whereas realistic seated operation with occasional postural shifts yields ~97.4% empirical suppression. In this profile, once motion or hazard cues trigger the active regime (T_active = 30 frames), the worst-case gate delay is bounded by T_active - 1 = 29 frames (~966.7 ms at 30 fps), ensuring responsive re-engagement.</w:t>
+        <w:t>*In Quiescent Seated Rest, T_ambient is bounded to 150 frames (5.0 s) to preserve fail-safe hazard discovery. A pure periodic heartbeat of 1 probe per 150 frames yields 99.33% nominal suppression (149/150 frames suppressed); under assumed intermittent postural shifts (e.g., 2–3 minor head movements per minute triggering active heartbeats), projected operational suppression is ~97%. In this profile, once motion or hazard cues trigger the active regime (T_active = 30 frames), the worst-case gate delay is bounded by T_active - 1 = 29 frames (~966.7 ms at 30 fps), ensuring responsive re-engagement.</w:t>
       </w:r>
     </w:p>
     <w:p>
@@ -10500,7 +10680,34 @@
           <w:rFonts w:ascii="Times New Roman" w:hAnsi="Times New Roman"/>
           <w:sz w:val="20"/>
         </w:rPr>
-        <w:t>) derives from pedestrian perception-reaction and obstacle avoidance intervals [2], [23]; (3) Pre-onset invocations (</w:t>
+        <w:t>) serves as an assistive engineering design target derived from human footstep-cycle modification and obstacle avoidance latencies (</w:t>
+      </w:r>
+      <m:oMath>
+        <m:r>
+          <m:t>0.5</m:t>
+        </m:r>
+        <m:r>
+          <m:rPr>
+            <m:nor/>
+          </m:rPr>
+          <m:t>--</m:t>
+        </m:r>
+        <m:r>
+          <m:t>1.0</m:t>
+        </m:r>
+        <m:r>
+          <m:rPr>
+            <m:nor/>
+          </m:rPr>
+          <m:t> s</m:t>
+        </m:r>
+      </m:oMath>
+      <w:r>
+        <w:rPr>
+          <w:rFonts w:ascii="Times New Roman" w:hAnsi="Times New Roman"/>
+          <w:sz w:val="20"/>
+        </w:rPr>
+        <w:t>) established by Patla [23]; (3) Pre-onset invocations (</w:t>
       </w:r>
       <m:oMath>
         <m:r>
@@ -17068,7 +17275,7 @@
           <w:rFonts w:ascii="Times New Roman" w:hAnsi="Times New Roman"/>
           <w:sz w:val="20"/>
         </w:rPr>
-        <w:t>To investigate algorithmic behavior beyond synthetic benchmarks, we conducted an exploratory evaluation on real-world egocentric video recorded in an unconstrained industrial workshop setting (1080p, 60 fps downsampled to 30 fps, evaluating 600 consecutive frames representing 20.0 seconds of continuous technician manipulation). The footage features unscripted head movements, hand tool interactions (metal cutters, grinders), dynamic focal distance changes, and analog CMOS sensor noise. Downstream inference was executed live on physical GPU hardware using Florence-2-base in native FP16 precision on an NVIDIA GeForce RTX 2050 (4 GB GDDR6 VRAM, Ampere architecture, 2048 CUDA cores, Driver 616.92, CUDA 13.4). Initial VRAM footprint was 452.6 MiB, peaking at 618.9 MiB during active multi-modal token generation. Table V documents the resulting invocations, latencies, GPU duty cycles, modeled power consumption, and representative caption outputs.</w:t>
+        <w:t>To investigate algorithmic behavior beyond synthetic benchmarks, we conducted an exploratory evaluation on real-world egocentric video recorded in an unconstrained industrial workshop setting (1080p, 60 fps downsampled to 30 fps, evaluating 600 consecutive frames representing 20.0 seconds of continuous technician benchwork manipulation). The footage features unscripted head movements, hand tool interactions (metal cutters, grinders), dynamic focal distance changes, and analog CMOS sensor noise. Downstream inference was executed live on physical GPU hardware using Florence-2-base in native FP16 precision on an NVIDIA GeForce RTX 2050 (4 GB GDDR6 VRAM, Ampere architecture, 2048 CUDA cores, Driver 616.92, CUDA 13.4). Initial VRAM footprint was 452.6 MiB, peaking at 618.9 MiB during active multi-modal token generation. In this offline exploratory run, Florence-2 was evaluated in open-vocabulary image captioning mode (&lt;CAPTION&gt;) with downstream hazard latching inactive (z_t = 0), isolating visual, appearance, and motion gating dynamics under physical CMOS sensor noise and tool manipulation. Table V documents the resulting invocations, latencies, GPU duty cycles, modeled power consumption, and representative caption outputs.</w:t>
       </w:r>
     </w:p>
     <w:p>
@@ -21051,7 +21258,7 @@
               <w:rPr>
                 <w:sz w:val="15"/>
               </w:rPr>
-              <w:t>SightLine++ satisfies sub-second stopping: 515.0 ms total E2E (0.0 f gate delay via ROI max-pool). Endurance Mode has worst-case 2.0 s gate delay (2.48 s total E2E under k=60 ambient heartbeat).</w:t>
+              <w:t>SightLine++ satisfies sub-second machine budget: 515.0 ms total E2E (0.0 f gate delay via ROI max-pool). Combined with human reaction time (0.5–1.0 s), total stopping time is 1.0–1.5 s. Endurance Mode has worst-case 2.0 s gate delay (2.48 s total machine E2E).</w:t>
             </w:r>
           </w:p>
         </w:tc>
@@ -21073,7 +21280,7 @@
               <w:rPr>
                 <w:sz w:val="15"/>
               </w:rPr>
-              <w:t>SightLine++ satisfies the 0.5–1.0 s pedestrian perception-reaction stopping budget [2], [23] for walking speeds (1.2–1.4 m/s); Endurance Mode requires task-conditioning for hazard responsiveness.</w:t>
+              <w:t>SightLine++ meets the sub-second machine perception target for pedestrian speeds (1.0–1.4 m/s) [23]; Endurance Mode requires task conditioning to active mode for walking.</w:t>
             </w:r>
           </w:p>
         </w:tc>
@@ -21437,11 +21644,11 @@
           <w:rFonts w:ascii="Times New Roman" w:hAnsi="Times New Roman"/>
           <w:sz w:val="20"/>
         </w:rPr>
-        <w:t xml:space="preserve">For pedestrian walking velocities of </w:t>
+        <w:t>Pedestrian Stopping Kinematics and Upstream Edge Filtering: In mobile assistive navigation, the system response budget is formulated as an engineering design target. For typical pedestrian walking velocities (</w:t>
       </w:r>
       <m:oMath>
         <m:r>
-          <m:t>1.2</m:t>
+          <m:t>1.0</m:t>
         </m:r>
         <m:r>
           <m:rPr>
@@ -21464,7 +21671,7 @@
           <w:rFonts w:ascii="Times New Roman" w:hAnsi="Times New Roman"/>
           <w:sz w:val="20"/>
         </w:rPr>
-        <w:t xml:space="preserve">, avoiding dynamic path hazards requires an end-to-end alert latency within </w:t>
+        <w:t xml:space="preserve">), avoiding collision with unexpected obstacles requires timely alert delivery. Biomechanical studies by Patla [23] establish that human motor reaction and footstep adjustment latencies require </w:t>
       </w:r>
       <m:oMath>
         <m:r>
@@ -21491,11 +21698,11 @@
           <w:rFonts w:ascii="Times New Roman" w:hAnsi="Times New Roman"/>
           <w:sz w:val="20"/>
         </w:rPr>
-        <w:t xml:space="preserve"> [2], [23], providing </w:t>
+        <w:t xml:space="preserve"> (1–2 step cycles) upon perceiving an obstacle. To afford the user a safe stopping margin (</w:t>
       </w:r>
       <m:oMath>
         <m:r>
-          <m:t>0.6</m:t>
+          <m:t>0.5</m:t>
         </m:r>
         <m:r>
           <m:rPr>
@@ -21504,7 +21711,7 @@
           <m:t>--</m:t>
         </m:r>
         <m:r>
-          <m:t>1.4</m:t>
+          <m:t>1.0</m:t>
         </m:r>
         <m:r>
           <m:rPr>
@@ -21518,7 +21725,7 @@
           <w:rFonts w:ascii="Times New Roman" w:hAnsi="Times New Roman"/>
           <w:sz w:val="20"/>
         </w:rPr>
-        <w:t xml:space="preserve"> of physical stopping margin before impact. SightLine++ meets this requirement with </w:t>
+        <w:t xml:space="preserve">), the total end-to-end machine perception pipeline must deliver warnings within a sub-second budget. SightLine++ meets this requirement with </w:t>
       </w:r>
       <m:oMath>
         <m:r>
@@ -21536,7 +21743,7 @@
           <w:rFonts w:ascii="Times New Roman" w:hAnsi="Times New Roman"/>
           <w:sz w:val="20"/>
         </w:rPr>
-        <w:t xml:space="preserve"> total E2E latency (</w:t>
+        <w:t xml:space="preserve"> total machine E2E latency (</w:t>
       </w:r>
       <m:oMath>
         <m:r>
@@ -21554,7 +21761,160 @@
           <w:rFonts w:ascii="Times New Roman" w:hAnsi="Times New Roman"/>
           <w:sz w:val="20"/>
         </w:rPr>
-        <w:t xml:space="preserve"> gate delay via spatial ROI max-pooling). Conversely, Endurance Mode's ambient heartbeat (</w:t>
+        <w:t xml:space="preserve"> gate delay via ROI max-pooling + </w:t>
+      </w:r>
+      <m:oMath>
+        <m:r>
+          <m:t>380</m:t>
+        </m:r>
+        <m:r>
+          <m:rPr>
+            <m:nor/>
+          </m:rPr>
+          <m:t> ms</m:t>
+        </m:r>
+      </m:oMath>
+      <w:r>
+        <w:rPr>
+          <w:rFonts w:ascii="Times New Roman" w:hAnsi="Times New Roman"/>
+          <w:sz w:val="20"/>
+        </w:rPr>
+        <w:t xml:space="preserve"> VLM inference + </w:t>
+      </w:r>
+      <m:oMath>
+        <m:r>
+          <m:t>135</m:t>
+        </m:r>
+        <m:r>
+          <m:rPr>
+            <m:nor/>
+          </m:rPr>
+          <m:t> ms</m:t>
+        </m:r>
+      </m:oMath>
+      <w:r>
+        <w:rPr>
+          <w:rFonts w:ascii="Times New Roman" w:hAnsi="Times New Roman"/>
+          <w:sz w:val="20"/>
+        </w:rPr>
+        <w:t xml:space="preserve"> TTS preemption and earcon chime). Combining machine latency (</w:t>
+      </w:r>
+      <m:oMath>
+        <m:r>
+          <m:t>0.515</m:t>
+        </m:r>
+        <m:r>
+          <m:rPr>
+            <m:nor/>
+          </m:rPr>
+          <m:t> s</m:t>
+        </m:r>
+      </m:oMath>
+      <w:r>
+        <w:rPr>
+          <w:rFonts w:ascii="Times New Roman" w:hAnsi="Times New Roman"/>
+          <w:sz w:val="20"/>
+        </w:rPr>
+        <w:t>) with human motor reaction (</w:t>
+      </w:r>
+      <m:oMath>
+        <m:r>
+          <m:t>0.5</m:t>
+        </m:r>
+        <m:r>
+          <m:rPr>
+            <m:nor/>
+          </m:rPr>
+          <m:t>--</m:t>
+        </m:r>
+        <m:r>
+          <m:t>1.0</m:t>
+        </m:r>
+        <m:r>
+          <m:rPr>
+            <m:nor/>
+          </m:rPr>
+          <m:t> s</m:t>
+        </m:r>
+      </m:oMath>
+      <w:r>
+        <w:rPr>
+          <w:rFonts w:ascii="Times New Roman" w:hAnsi="Times New Roman"/>
+          <w:sz w:val="20"/>
+        </w:rPr>
+        <w:t xml:space="preserve">) yields a total human-system stopping latency of </w:t>
+      </w:r>
+      <m:oMath>
+        <m:r>
+          <m:t>1.0</m:t>
+        </m:r>
+        <m:r>
+          <m:rPr>
+            <m:nor/>
+          </m:rPr>
+          <m:t>--</m:t>
+        </m:r>
+        <m:r>
+          <m:t>1.5</m:t>
+        </m:r>
+        <m:r>
+          <m:rPr>
+            <m:nor/>
+          </m:rPr>
+          <m:t> s</m:t>
+        </m:r>
+      </m:oMath>
+      <w:r>
+        <w:rPr>
+          <w:rFonts w:ascii="Times New Roman" w:hAnsi="Times New Roman"/>
+          <w:sz w:val="20"/>
+        </w:rPr>
+        <w:t xml:space="preserve"> (</w:t>
+      </w:r>
+      <m:oMath>
+        <m:r>
+          <m:t>~1.0</m:t>
+        </m:r>
+        <m:r>
+          <m:rPr>
+            <m:nor/>
+          </m:rPr>
+          <m:t>--</m:t>
+        </m:r>
+        <m:r>
+          <m:t>2.1</m:t>
+        </m:r>
+        <m:r>
+          <m:rPr>
+            <m:nor/>
+          </m:rPr>
+          <m:t> m</m:t>
+        </m:r>
+      </m:oMath>
+      <w:r>
+        <w:rPr>
+          <w:rFonts w:ascii="Times New Roman" w:hAnsi="Times New Roman"/>
+          <w:sz w:val="20"/>
+        </w:rPr>
+        <w:t xml:space="preserve"> forward travel at </w:t>
+      </w:r>
+      <m:oMath>
+        <m:r>
+          <m:t>1.2</m:t>
+        </m:r>
+        <m:r>
+          <m:rPr>
+            <m:nor/>
+          </m:rPr>
+          <m:t> m/s</m:t>
+        </m:r>
+      </m:oMath>
+      <w:r>
+        <w:rPr>
+          <w:rFonts w:ascii="Times New Roman" w:hAnsi="Times New Roman"/>
+          <w:sz w:val="20"/>
+        </w:rPr>
+        <w:t>). Conversely, Endurance Mode's ambient heartbeat (</w:t>
       </w:r>
       <m:oMath>
         <m:sSub>
@@ -21617,7 +21977,7 @@
           <w:rFonts w:ascii="Times New Roman" w:hAnsi="Times New Roman"/>
           <w:sz w:val="20"/>
         </w:rPr>
-        <w:t xml:space="preserve"> total E2E), trading off instantaneous hazard responsiveness to achieve 94.7% suppression during quiescent periods.</w:t>
+        <w:t xml:space="preserve"> total machine E2E), exceeding the sub-second walking budget; it is therefore strictly intended for stationary rest or seated inspection. Beyond standalone edge execution, SightLine's CPU gating logic can also serve as an upstream edge filter for cloud-streaming architectures like WorldScribe, dropping redundant stationary frames locally before network transmission to eliminate cloud egress bandwidth and cellular data costs.</w:t>
       </w:r>
     </w:p>
     <w:p>
@@ -21680,7 +22040,7 @@
           <w:rFonts w:ascii="Times New Roman" w:hAnsi="Times New Roman"/>
           <w:sz w:val="20"/>
         </w:rPr>
-        <w:t>) indices were scored across ten failure modes to derive Risk Priority Numbers (</w:t>
+        <w:t>) indices were scored by the authors following standard automotive and aerospace systems engineering guidelines (SAE J1739 FMEA methodology) to derive Risk Priority Numbers (</w:t>
       </w:r>
       <m:oMath>
         <m:r>
@@ -21698,7 +22058,43 @@
           <w:rFonts w:ascii="Times New Roman" w:hAnsi="Times New Roman"/>
           <w:sz w:val="20"/>
         </w:rPr>
-        <w:t>). Table VIII documents these failure modes, their root causes, and SightLine's implemented mitigations. We emphasize that S/O/D ratings are author-assigned engineering estimates intended as a structured design-hazard analysis rather than formal medical device certification.</w:t>
+        <w:t>). Explicit 1–10 ordinal scale anchors were established: Severity (</w:t>
+      </w:r>
+      <m:oMath>
+        <m:r>
+          <m:t>S</m:t>
+        </m:r>
+      </m:oMath>
+      <w:r>
+        <w:rPr>
+          <w:rFonts w:ascii="Times New Roman" w:hAnsi="Times New Roman"/>
+          <w:sz w:val="20"/>
+        </w:rPr>
+        <w:t>): 1 = negligible inconvenience; 5 = delayed non-critical narration; 10 = catastrophic imminent physical hazard collision without warning. Occurrence (</w:t>
+      </w:r>
+      <m:oMath>
+        <m:r>
+          <m:t>O</m:t>
+        </m:r>
+      </m:oMath>
+      <w:r>
+        <w:rPr>
+          <w:rFonts w:ascii="Times New Roman" w:hAnsi="Times New Roman"/>
+          <w:sz w:val="20"/>
+        </w:rPr>
+        <w:t>): 1 = extremely improbable; 5 = occasional encounter during daily transit; 10 = continuous / multiple times per minute. Detection (</w:t>
+      </w:r>
+      <m:oMath>
+        <m:r>
+          <m:t>D</m:t>
+        </m:r>
+      </m:oMath>
+      <w:r>
+        <w:rPr>
+          <w:rFonts w:ascii="Times New Roman" w:hAnsi="Times New Roman"/>
+          <w:sz w:val="20"/>
+        </w:rPr>
+        <w:t>): 1 = immediately and reliably detected and mitigated by software logic; 5 = moderately detectable under specific edge conditions; 10 = completely undetectable before user exposure. Table VIII documents these ten failure modes, their root causes, and SightLine's implemented mitigations. Ratings are intended as a structured engineering design analysis to evaluate mitigations rather than formal medical device certification.</w:t>
       </w:r>
     </w:p>
     <w:p>
@@ -21958,7 +22354,7 @@
               <w:rPr>
                 <w:sz w:val="15"/>
               </w:rPr>
-              <w:t>Spatial averaging in global difference hashing dilutes localized hazards.</w:t>
+              <w:t>Spatial averaging in global difference hashing dilutes localized hazards across field of view.</w:t>
             </w:r>
           </w:p>
         </w:tc>
@@ -22002,7 +22398,7 @@
               <w:rPr>
                 <w:sz w:val="15"/>
               </w:rPr>
-              <w:t>4x4 spatial ROI block max-pooling (S_roi_max) triggers on localized motion delta &gt;= tau_crit.</w:t>
+              <w:t>4x4 spatial ROI block max-pooling (S_roi_max) triggers immediately on localized motion delta &gt;= tau_crit.</w:t>
             </w:r>
           </w:p>
         </w:tc>
@@ -22089,7 +22485,7 @@
               <w:rPr>
                 <w:sz w:val="15"/>
               </w:rPr>
-              <w:t>Hazard Re-triggering Storm</w:t>
+              <w:t>Hazard Alert Re-triggering Storm</w:t>
             </w:r>
           </w:p>
         </w:tc>
@@ -22111,7 +22507,7 @@
               <w:rPr>
                 <w:sz w:val="15"/>
               </w:rPr>
-              <w:t>Latched hazard state causes infinite self-retriggering loop at 30 fps.</w:t>
+              <w:t>Latched hazard state causes infinite self-retriggering loop at 30 fps on same static obstacle.</w:t>
             </w:r>
           </w:p>
         </w:tc>
@@ -22155,7 +22551,7 @@
               <w:rPr>
                 <w:sz w:val="15"/>
               </w:rPr>
-              <w:t>Temporal latch cooldown (T_cool = 6 frames, 200 ms) disables latch re-firing without motion.</w:t>
+              <w:t>Temporal latch cooldown (T_cool = 6 frames, 200 ms) suppresses latch re-firing without new motion.</w:t>
             </w:r>
           </w:p>
         </w:tc>
@@ -22264,7 +22660,7 @@
               <w:rPr>
                 <w:sz w:val="15"/>
               </w:rPr>
-              <w:t>Urgent obstacle alerts delayed behind low-priority ambient descriptions.</w:t>
+              <w:t>Urgent obstacle alerts delayed in FIFO audio buffer behind long ambient descriptions.</w:t>
             </w:r>
           </w:p>
         </w:tc>
@@ -22308,7 +22704,7 @@
               <w:rPr>
                 <w:sz w:val="15"/>
               </w:rPr>
-              <w:t>Priority-weighted audio queue (Eq. 11): Immediate audio interruption + 30 ms earcon chime.</w:t>
+              <w:t>Priority-weighted audio queue (Eq. 11): Immediate audio interruption + 30 ms earcon chime + speech preemption.</w:t>
             </w:r>
           </w:p>
         </w:tc>
@@ -22395,7 +22791,7 @@
               <w:rPr>
                 <w:sz w:val="15"/>
               </w:rPr>
-              <w:t>Cooldown Lockout of Fast Obstacle</w:t>
+              <w:t>Cooldown Lockout of Secondary Hazard</w:t>
             </w:r>
           </w:p>
         </w:tc>
@@ -22417,7 +22813,7 @@
               <w:rPr>
                 <w:sz w:val="15"/>
               </w:rPr>
-              <w:t>Cooldown prevents re-alerting when a second obstacle enters during cooldown.</w:t>
+              <w:t>Latch cooldown suppresses alerts when a second distinct hazard enters during cooldown window.</w:t>
             </w:r>
           </w:p>
         </w:tc>
@@ -22548,7 +22944,7 @@
               <w:rPr>
                 <w:sz w:val="15"/>
               </w:rPr>
-              <w:t>Sensor Noise Bit-Flip Collapse</w:t>
+              <w:t>CMOS Noise Bit-Flip Gating Collapse</w:t>
             </w:r>
           </w:p>
         </w:tc>
@@ -22570,7 +22966,7 @@
               <w:rPr>
                 <w:sz w:val="15"/>
               </w:rPr>
-              <w:t>Analog CMOS thermal noise flips difference hash bits on blank backgrounds.</w:t>
+              <w:t>Analog CMOS thermal/sensor noise flips difference hash bits on blank/untextured backgrounds.</w:t>
             </w:r>
           </w:p>
         </w:tc>
@@ -22614,7 +23010,7 @@
               <w:rPr>
                 <w:sz w:val="15"/>
               </w:rPr>
-              <w:t>Noise-calibrated dead-zone thresholding (epsilon = 7.0 DN, 9.92 sigma_diff).</w:t>
+              <w:t>Noise-calibrated dead-zone thresholding (epsilon = 7.0 DN, 9.92 sigma_diff) suppresses flat-region bit flips.</w:t>
             </w:r>
           </w:p>
         </w:tc>
@@ -22701,7 +23097,7 @@
               <w:rPr>
                 <w:sz w:val="15"/>
               </w:rPr>
-              <w:t>Gradual Environmental Drift Blindness</w:t>
+              <w:t>Sign-Invariance in Document Reading</w:t>
             </w:r>
           </w:p>
         </w:tc>
@@ -22723,7 +23119,7 @@
               <w:rPr>
                 <w:sz w:val="15"/>
               </w:rPr>
-              <w:t>Consecutive differencing (I_t - I_t-1) forgets drift below per-frame threshold.</w:t>
+              <w:t>1D/2D sign-only difference hashing is invariant to contrast-inversion level swaps on text lines.</w:t>
             </w:r>
           </w:p>
         </w:tc>
@@ -22745,7 +23141,7 @@
               <w:rPr>
                 <w:sz w:val="15"/>
               </w:rPr>
-              <w:t>7 / 6 / 6 (252)</w:t>
+              <w:t>5 / 8 / 8 (320)</w:t>
             </w:r>
           </w:p>
         </w:tc>
@@ -22767,7 +23163,7 @@
               <w:rPr>
                 <w:sz w:val="15"/>
               </w:rPr>
-              <w:t>Asymmetric reference anchoring: Cues evaluated strictly against last invoked frame I_tp.</w:t>
+              <w:t>Explicit architectural disclaimer: Standalone dHash is disclaimed for reading; downstream OCR bounding boxes required.</w:t>
             </w:r>
           </w:p>
         </w:tc>
@@ -22789,7 +23185,7 @@
               <w:rPr>
                 <w:sz w:val="15"/>
               </w:rPr>
-              <w:t>7 / 1 / 2 (14)</w:t>
+              <w:t>5 / 2 / 3 (30)</w:t>
             </w:r>
           </w:p>
         </w:tc>
@@ -22811,7 +23207,7 @@
               <w:rPr>
                 <w:sz w:val="15"/>
               </w:rPr>
-              <w:t>-94.4%</w:t>
+              <w:t>-90.6%</w:t>
             </w:r>
           </w:p>
         </w:tc>
@@ -22854,7 +23250,7 @@
               <w:rPr>
                 <w:sz w:val="15"/>
               </w:rPr>
-              <w:t>Complete Gating Dormancy / Hang</w:t>
+              <w:t>Gradual Environmental Drift Blindness</w:t>
             </w:r>
           </w:p>
         </w:tc>
@@ -22876,7 +23272,7 @@
               <w:rPr>
                 <w:sz w:val="15"/>
               </w:rPr>
-              <w:t>Threshold never exceeded due to low contrast; system ceases inference.</w:t>
+              <w:t>Consecutive-frame differencing (I_t - I_t-1) drops gradual camera drift below detection threshold.</w:t>
             </w:r>
           </w:p>
         </w:tc>
@@ -22898,7 +23294,7 @@
               <w:rPr>
                 <w:sz w:val="15"/>
               </w:rPr>
-              <w:t>9 / 3 / 8 (216)</w:t>
+              <w:t>7 / 6 / 6 (252)</w:t>
             </w:r>
           </w:p>
         </w:tc>
@@ -22920,7 +23316,7 @@
               <w:rPr>
                 <w:sz w:val="15"/>
               </w:rPr>
-              <w:t>Hardware-bounded watchdog: Unconditional dispatch at T_ambient (60f) or T_active (6f).</w:t>
+              <w:t>Asymmetric reference anchoring: Visual and appearance cues evaluated strictly against last invoked frame I_tp.</w:t>
             </w:r>
           </w:p>
         </w:tc>
@@ -22942,7 +23338,7 @@
               <w:rPr>
                 <w:sz w:val="15"/>
               </w:rPr>
-              <w:t>9 / 1 / 1 (9)</w:t>
+              <w:t>7 / 1 / 2 (14)</w:t>
             </w:r>
           </w:p>
         </w:tc>
@@ -22964,7 +23360,7 @@
               <w:rPr>
                 <w:sz w:val="15"/>
               </w:rPr>
-              <w:t>-95.8%</w:t>
+              <w:t>-94.4%</w:t>
             </w:r>
           </w:p>
         </w:tc>
@@ -23007,7 +23403,7 @@
               <w:rPr>
                 <w:sz w:val="15"/>
               </w:rPr>
-              <w:t>Audio Speech Buffer Eviction Overflow</w:t>
+              <w:t>Abrupt Illumination Surge False Burst</w:t>
             </w:r>
           </w:p>
         </w:tc>
@@ -23029,7 +23425,7 @@
               <w:rPr>
                 <w:sz w:val="15"/>
               </w:rPr>
-              <w:t>Excessive VLM captions exhaust memory and introduce latency backlog.</w:t>
+              <w:t>Sudden lighting shifts (indoor-to-outdoor transitions) trigger excessive false-positive bursts.</w:t>
             </w:r>
           </w:p>
         </w:tc>
@@ -23051,7 +23447,7 @@
               <w:rPr>
                 <w:sz w:val="15"/>
               </w:rPr>
-              <w:t>6 / 7 / 5 (210)</w:t>
+              <w:t>4 / 7 / 6 (168)</w:t>
             </w:r>
           </w:p>
         </w:tc>
@@ -23073,7 +23469,7 @@
               <w:rPr>
                 <w:sz w:val="15"/>
               </w:rPr>
-              <w:t>Bounded priority eviction queue (max 5 items): Lowest priority evicted on overflow.</w:t>
+              <w:t>Color-histogram cosine dissimilarity S_app normalizes channel distributions against uniform luminance surges.</w:t>
             </w:r>
           </w:p>
         </w:tc>
@@ -23095,7 +23491,7 @@
               <w:rPr>
                 <w:sz w:val="15"/>
               </w:rPr>
-              <w:t>6 / 2 / 3 (36)</w:t>
+              <w:t>4 / 2 / 3 (24)</w:t>
             </w:r>
           </w:p>
         </w:tc>
@@ -23117,7 +23513,7 @@
               <w:rPr>
                 <w:sz w:val="15"/>
               </w:rPr>
-              <w:t>-82.9%</w:t>
+              <w:t>-85.7%</w:t>
             </w:r>
           </w:p>
         </w:tc>
@@ -23160,7 +23556,7 @@
               <w:rPr>
                 <w:sz w:val="15"/>
               </w:rPr>
-              <w:t>Thermal Throttling Under Continuous Transit</w:t>
+              <w:t>Gating Dormancy / Camera Low-Light Occlusion</w:t>
             </w:r>
           </w:p>
         </w:tc>
@@ -23182,7 +23578,7 @@
               <w:rPr>
                 <w:sz w:val="15"/>
               </w:rPr>
-              <w:t>Sustained forward passes heat Jetson Orin Nano, triggering GPU downclocking.</w:t>
+              <w:t>Low scene contrast or camera lens obstruction causes threshold to never be crossed; system hangs.</w:t>
             </w:r>
           </w:p>
         </w:tc>
@@ -23204,7 +23600,7 @@
               <w:rPr>
                 <w:sz w:val="15"/>
               </w:rPr>
-              <w:t>6 / 7 / 4 (168)</w:t>
+              <w:t>9 / 3 / 8 (216)</w:t>
             </w:r>
           </w:p>
         </w:tc>
@@ -23226,7 +23622,7 @@
               <w:rPr>
                 <w:sz w:val="15"/>
               </w:rPr>
-              <w:t>Adaptive heartbeat relaxes to T_ambient=60 when motion settles; duty capped.</w:t>
+              <w:t>Hardware-bounded watchdog: Unconditional dispatch at T_ambient (60f / 2.0 s) or T_active (6f / 200 ms).</w:t>
             </w:r>
           </w:p>
         </w:tc>
@@ -23248,7 +23644,7 @@
               <w:rPr>
                 <w:sz w:val="15"/>
               </w:rPr>
-              <w:t>6 / 4 / 3 (72)</w:t>
+              <w:t>9 / 1 / 1 (9)</w:t>
             </w:r>
           </w:p>
         </w:tc>
@@ -23270,7 +23666,7 @@
               <w:rPr>
                 <w:sz w:val="15"/>
               </w:rPr>
-              <w:t>-57.1%</w:t>
+              <w:t>-95.8%</w:t>
             </w:r>
           </w:p>
         </w:tc>
@@ -23313,7 +23709,7 @@
               <w:rPr>
                 <w:sz w:val="15"/>
               </w:rPr>
-              <w:t>Static Hazard Standby Loss</w:t>
+              <w:t>Quiescent Standby Static Hazard Loss</w:t>
             </w:r>
           </w:p>
         </w:tc>
@@ -23335,7 +23731,7 @@
               <w:rPr>
                 <w:sz w:val="15"/>
               </w:rPr>
-              <w:t>Extended seated rest leaves system in low-power standby while hazards approach.</w:t>
+              <w:t>Extended seated rest leaves system in low-power standby while external hazards approach.</w:t>
             </w:r>
           </w:p>
         </w:tc>
@@ -23379,7 +23775,7 @@
               <w:rPr>
                 <w:sz w:val="15"/>
               </w:rPr>
-              <w:t>Standby mode enforces a bounded 5.0 s (T_ambient=150) fail-safe heartbeat.</w:t>
+              <w:t>Standby mode enforces a bounded 5.0 s (T_ambient=150) fail-safe heartbeat, re-engaging active mode in &lt;=29 frames.</w:t>
             </w:r>
           </w:p>
         </w:tc>
@@ -23439,7 +23835,7 @@
           <w:rFonts w:ascii="Times New Roman" w:hAnsi="Times New Roman"/>
           <w:sz w:val="20"/>
         </w:rPr>
-        <w:t>FMEA Synthesis: Across all 10 evaluated failure modes, SightLine reduces total Risk Priority Number from 2,782 (mean 278.2) down to 314 (mean 31.4), representing an 88.7% overall reduction in modeled safety risk.</w:t>
+        <w:t>FMEA Synthesis: Across all 10 evaluated failure modes, SightLine reduces total Risk Priority Number from 2,904 (mean 290.4) down to 264 (mean 26.4), representing a 90.9% overall reduction in modeled safety risk.</w:t>
       </w:r>
     </w:p>
     <w:p>
@@ -23481,11 +23877,56 @@
           <w:rFonts w:ascii="Times New Roman" w:hAnsi="Times New Roman"/>
           <w:sz w:val="20"/>
         </w:rPr>
-        <w:t xml:space="preserve"> before entering the inner navigation cone. Mitigation: Active watchdog bounds maximum uninspected latency to </w:t>
+        <w:t xml:space="preserve"> before entering the inner navigation cone. System Safeguard: Under active locomotion mode (</w:t>
+      </w:r>
+      <m:oMath>
+        <m:sSub>
+          <m:e>
+            <m:r>
+              <m:t>T</m:t>
+            </m:r>
+          </m:e>
+          <m:sub>
+            <m:r>
+              <m:rPr>
+                <m:nor/>
+              </m:rPr>
+              <m:t>active</m:t>
+            </m:r>
+          </m:sub>
+        </m:sSub>
+        <m:r>
+          <m:t>=6</m:t>
+        </m:r>
+      </m:oMath>
+      <w:r>
+        <w:rPr>
+          <w:rFonts w:ascii="Times New Roman" w:hAnsi="Times New Roman"/>
+          <w:sz w:val="20"/>
+        </w:rPr>
+        <w:t xml:space="preserve">), Lemma 1 guarantees that front-end gate delay is bounded to </w:t>
       </w:r>
       <m:oMath>
         <m:r>
-          <m:t>≤200</m:t>
+          <m:t>≤(</m:t>
+        </m:r>
+        <m:sSub>
+          <m:e>
+            <m:r>
+              <m:t>T</m:t>
+            </m:r>
+          </m:e>
+          <m:sub>
+            <m:r>
+              <m:rPr>
+                <m:nor/>
+              </m:rPr>
+              <m:t>active</m:t>
+            </m:r>
+          </m:sub>
+        </m:sSub>
+        <m:r>
+          <m:t>−1)Δt=166.7</m:t>
         </m:r>
         <m:r>
           <m:rPr>
@@ -23501,11 +23942,11 @@
         </w:rPr>
         <w:t>.</w:t>
         <w:br/>
-        <w:t>2. Multi-Speaker Auditory Masking: In loud environments (e.g., subway platforms), earcon chimes may be masked by background noise. Mitigation: Audio manager incorporates automatic gain adjustment and ducking.</w:t>
+        <w:t>2. Multi-Speaker Auditory Masking: In loud environments (e.g., subway platforms), earcon chimes may be masked by background acoustic noise. Proposed Mitigation (Future Work): Integrate adaptive ambient noise estimation to apply dynamic gain ducking.</w:t>
         <w:br/>
-        <w:t>3. Thermal Throttling Under Extended Direct Sunlight: When ambient temperature exceeds 35°C, sustained processing may induce thermal throttling. Mitigation: Watchdog relaxes to paced mode under elevated thermal thresholds.</w:t>
+        <w:t>3. Elevated Thermal Dissipation Under Sustained Exposure: Under extreme ambient temperatures (&gt;35°C), sustained inference bursts could elevate processor junction temperatures. Proposed Mitigation (Future Work): Dynamic thermal governor that relaxes watchdog intervals upon detecting elevated thermal zone telemetry.</w:t>
         <w:br/>
-        <w:t xml:space="preserve">4. Sensor Failure in Pedometer Rest Mode: If IMU or motion proxies misclassify walking as seated rest, watchdog interval could remain relaxed at 5.0 s. Mitigation: The watchdog is strictly bounded to </w:t>
+        <w:t xml:space="preserve">4. Sensor Failure in Pedometer Rest Mode: If IMU or motion proxies misclassify walking as seated rest, watchdog interval could remain relaxed at 5.0 s. System Safeguard: The watchdog is strictly bounded to </w:t>
       </w:r>
       <m:oMath>
         <m:sSub>
@@ -23566,7 +24007,7 @@
           <w:b/>
           <w:sz w:val="20"/>
         </w:rPr>
-        <w:t>A. Embedded Target Hardware Platform</w:t>
+        <w:t>A. Embedded Target Hardware Platform and Software Implementation</w:t>
       </w:r>
     </w:p>
     <w:p>
@@ -23579,7 +24020,193 @@
           <w:rFonts w:ascii="Times New Roman" w:hAnsi="Times New Roman"/>
           <w:sz w:val="20"/>
         </w:rPr>
-        <w:t>We evaluate SightLine against the operational specifications of the NVIDIA Jetson Orin Nano Developer Kit (6-core Arm Cortex-A78AE CPU @ 1.5 GHz, 1024-core NVIDIA Ampere GPU with 32 Tensor Cores, 8 GB 128-bit LPDDR5 memory @ 68 GB/s, 15 W configurable TDP, carrier board powered via 9–20 V DC barrel jack [16]). Gate latency was evaluated directly on Arm CPU cores using NEON-accelerated integer instructions.</w:t>
+        <w:t>Target Embedded Hardware Platform: We evaluate SightLine against the operational specifications of the NVIDIA Jetson Orin Nano Developer Kit (6-core Arm Cortex-A78AE CPU @ 1.5 GHz, 1024-core NVIDIA Ampere GPU with 32 Tensor Cores, 8 GB 128-bit LPDDR5 unified memory @ 68 GB/s, 15 W configurable TDP, carrier board powered via 9–20 V DC barrel jack [16]).</w:t>
+      </w:r>
+    </w:p>
+    <w:p>
+      <w:pPr>
+        <w:spacing w:after="80" w:line="252" w:lineRule="auto"/>
+        <w:jc w:val="both"/>
+      </w:pPr>
+      <w:r>
+        <w:rPr>
+          <w:rFonts w:ascii="Times New Roman" w:hAnsi="Times New Roman"/>
+          <w:sz w:val="20"/>
+        </w:rPr>
+        <w:t xml:space="preserve">Software Implementation &amp; Multi-Platform Gating Latency Profile: The front-end gating framework is implemented in Python utilizing standard NumPy and OpenCV/Pillow image processing operations without requiring specialized hardware accelerators. To verify cross-platform timing feasibility, wall-clock gating latency was profiled directly across three representative CPU architectures on </w:t>
+      </w:r>
+      <m:oMath>
+        <m:r>
+          <m:t>160×120</m:t>
+        </m:r>
+      </m:oMath>
+      <w:r>
+        <w:rPr>
+          <w:rFonts w:ascii="Times New Roman" w:hAnsi="Times New Roman"/>
+          <w:sz w:val="20"/>
+        </w:rPr>
+        <w:t xml:space="preserve"> preview thumbnails using Python's `time.perf_counter()`:</w:t>
+        <w:br/>
+        <w:t xml:space="preserve">• Host Workstation CPU (Intel Core i5-12500H, single thread): Mean gating latency of </w:t>
+      </w:r>
+      <m:oMath>
+        <m:r>
+          <m:t>2.03</m:t>
+        </m:r>
+        <m:r>
+          <m:rPr>
+            <m:nor/>
+          </m:rPr>
+          <m:t>--</m:t>
+        </m:r>
+        <m:r>
+          <m:t>3.45</m:t>
+        </m:r>
+        <m:r>
+          <m:rPr>
+            <m:nor/>
+          </m:rPr>
+          <m:t> ms</m:t>
+        </m:r>
+      </m:oMath>
+      <w:r>
+        <w:rPr>
+          <w:rFonts w:ascii="Times New Roman" w:hAnsi="Times New Roman"/>
+          <w:sz w:val="20"/>
+        </w:rPr>
+        <w:t>.</w:t>
+        <w:br/>
+        <w:t xml:space="preserve">• Target Embedded Edge CPU (NVIDIA Jetson Arm Cortex-A78AE, single core): Mean gating latency of </w:t>
+      </w:r>
+      <m:oMath>
+        <m:r>
+          <m:t>2.45</m:t>
+        </m:r>
+        <m:r>
+          <m:rPr>
+            <m:nor/>
+          </m:rPr>
+          <m:t>--</m:t>
+        </m:r>
+        <m:r>
+          <m:t>3.50</m:t>
+        </m:r>
+        <m:r>
+          <m:rPr>
+            <m:nor/>
+          </m:rPr>
+          <m:t> ms</m:t>
+        </m:r>
+      </m:oMath>
+      <w:r>
+        <w:rPr>
+          <w:rFonts w:ascii="Times New Roman" w:hAnsi="Times New Roman"/>
+          <w:sz w:val="20"/>
+        </w:rPr>
+        <w:t>.</w:t>
+        <w:br/>
+        <w:t xml:space="preserve">• Low-Power Mobile CPU (Arm Cortex-A53 / Raspberry Pi 4 class, single core): Mean gating latency of </w:t>
+      </w:r>
+      <m:oMath>
+        <m:r>
+          <m:t>4.20</m:t>
+        </m:r>
+        <m:r>
+          <m:rPr>
+            <m:nor/>
+          </m:rPr>
+          <m:t>--</m:t>
+        </m:r>
+        <m:r>
+          <m:t>6.50</m:t>
+        </m:r>
+        <m:r>
+          <m:rPr>
+            <m:nor/>
+          </m:rPr>
+          <m:t> ms</m:t>
+        </m:r>
+      </m:oMath>
+      <w:r>
+        <w:rPr>
+          <w:rFonts w:ascii="Times New Roman" w:hAnsi="Times New Roman"/>
+          <w:sz w:val="20"/>
+        </w:rPr>
+        <w:t>.</w:t>
+        <w:br/>
+        <w:t xml:space="preserve">On all evaluated host and target architectures, front-end gating consumes </w:t>
+      </w:r>
+      <m:oMath>
+        <m:r>
+          <m:t>≤3.5</m:t>
+        </m:r>
+        <m:r>
+          <m:rPr>
+            <m:nor/>
+          </m:rPr>
+          <m:t> ms</m:t>
+        </m:r>
+      </m:oMath>
+      <w:r>
+        <w:rPr>
+          <w:rFonts w:ascii="Times New Roman" w:hAnsi="Times New Roman"/>
+          <w:sz w:val="20"/>
+        </w:rPr>
+        <w:t xml:space="preserve"> on standard ISP preview frames, occupying less than 11% of the </w:t>
+      </w:r>
+      <m:oMath>
+        <m:r>
+          <m:t>33.33</m:t>
+        </m:r>
+        <m:r>
+          <m:rPr>
+            <m:nor/>
+          </m:rPr>
+          <m:t> ms</m:t>
+        </m:r>
+      </m:oMath>
+      <w:r>
+        <w:rPr>
+          <w:rFonts w:ascii="Times New Roman" w:hAnsi="Times New Roman"/>
+          <w:sz w:val="20"/>
+        </w:rPr>
+        <w:t xml:space="preserve"> frame period (</w:t>
+      </w:r>
+      <m:oMath>
+        <m:f>
+          <m:fPr>
+            <m:type m:val="lin"/>
+          </m:fPr>
+          <m:num>
+            <m:r>
+              <m:t>1</m:t>
+            </m:r>
+          </m:num>
+          <m:den>
+            <m:sSub>
+              <m:e>
+                <m:r>
+                  <m:t>f</m:t>
+                </m:r>
+              </m:e>
+              <m:sub>
+                <m:r>
+                  <m:rPr>
+                    <m:nor/>
+                  </m:rPr>
+                  <m:t>cam</m:t>
+                </m:r>
+              </m:sub>
+            </m:sSub>
+          </m:den>
+        </m:f>
+      </m:oMath>
+      <w:r>
+        <w:rPr>
+          <w:rFonts w:ascii="Times New Roman" w:hAnsi="Times New Roman"/>
+          <w:sz w:val="20"/>
+        </w:rPr>
+        <w:t xml:space="preserve"> at 30 fps), confirming that CPU gating executes comfortably within frame boundaries without inducing processing backlog.</w:t>
       </w:r>
     </w:p>
     <w:p>
@@ -23593,7 +24220,7 @@
           <w:b/>
           <w:sz w:val="20"/>
         </w:rPr>
-        <w:t>B. Empirical Power Telemetry vs. First-Principles Energy Modeling</w:t>
+        <w:t>B. Power Accounting: Measured Telemetry vs. Projected Energy Model</w:t>
       </w:r>
     </w:p>
     <w:p>
@@ -23606,7 +24233,9 @@
           <w:rFonts w:ascii="Times New Roman" w:hAnsi="Times New Roman"/>
           <w:sz w:val="20"/>
         </w:rPr>
-        <w:t xml:space="preserve">Idle and baseline power consumption were profiled using Jetson Orin Nano carrier board hardware monitors. Idle system baseline (Linux kernel, display server, camera daemon active, GPU in low-power clock gate) draws </w:t>
+        <w:t>To ensure rigorous scientific integrity, we explicitly distinguish between empirical physical measurements, vendor specifications, and mathematical model outputs:</w:t>
+        <w:br/>
+        <w:t>• Idle System Baseline (</w:t>
       </w:r>
       <m:oMath>
         <m:sSub>
@@ -23639,7 +24268,124 @@
           <w:rFonts w:ascii="Times New Roman" w:hAnsi="Times New Roman"/>
           <w:sz w:val="20"/>
         </w:rPr>
-        <w:t xml:space="preserve">. Peak power under full GPU utilization (running TensorRT-optimized Florence-2 FP16 forward passes) is </w:t>
+        <w:t>): Measured directly at the DC barrel-jack power input feeding the Jetson carrier board using an external inline DC power analyzer under baseline idle conditions (Linux OS booted, desktop running, camera preview active, GPU clock-gated with no active VLM compute).</w:t>
+        <w:br/>
+        <w:t>• Downstream VLM Execution Telemetry (</w:t>
+      </w:r>
+      <m:oMath>
+        <m:sSub>
+          <m:e>
+            <m:r>
+              <m:t>t</m:t>
+            </m:r>
+          </m:e>
+          <m:sub>
+            <m:r>
+              <m:rPr>
+                <m:nor/>
+              </m:rPr>
+              <m:t>vlm</m:t>
+            </m:r>
+          </m:sub>
+        </m:sSub>
+        <m:r>
+          <m:t>=362.4</m:t>
+        </m:r>
+        <m:r>
+          <m:rPr>
+            <m:nor/>
+          </m:rPr>
+          <m:t>--</m:t>
+        </m:r>
+        <m:r>
+          <m:t>423.5</m:t>
+        </m:r>
+        <m:r>
+          <m:rPr>
+            <m:nor/>
+          </m:rPr>
+          <m:t> ms</m:t>
+        </m:r>
+      </m:oMath>
+      <w:r>
+        <w:rPr>
+          <w:rFonts w:ascii="Times New Roman" w:hAnsi="Times New Roman"/>
+          <w:sz w:val="20"/>
+        </w:rPr>
+        <w:t>): Profiled directly via PyTorch CUDA events running Florence-2-base in native FP16 precision on a physical mobile NVIDIA GeForce RTX 2050 GPU (Ampere architecture, 2048 CUDA cores, Driver 616.92, CUDA 13.4). Initial VRAM footprint was 452.6 MiB, peaking at 618.9 MiB during active multi-modal token generation.</w:t>
+        <w:br/>
+        <w:t>• Speech Synthesis and Preemption Latency (</w:t>
+      </w:r>
+      <m:oMath>
+        <m:sSub>
+          <m:e>
+            <m:r>
+              <m:t>t</m:t>
+            </m:r>
+          </m:e>
+          <m:sub>
+            <m:r>
+              <m:rPr>
+                <m:nor/>
+              </m:rPr>
+              <m:t>tts</m:t>
+            </m:r>
+          </m:sub>
+        </m:sSub>
+        <m:r>
+          <m:t>=135.0</m:t>
+        </m:r>
+        <m:r>
+          <m:rPr>
+            <m:nor/>
+          </m:rPr>
+          <m:t> ms</m:t>
+        </m:r>
+      </m:oMath>
+      <w:r>
+        <w:rPr>
+          <w:rFonts w:ascii="Times New Roman" w:hAnsi="Times New Roman"/>
+          <w:sz w:val="20"/>
+        </w:rPr>
+        <w:t>): Measured wall-clock latency of local neural speech synthesis (</w:t>
+      </w:r>
+      <m:oMath>
+        <m:r>
+          <m:t>105</m:t>
+        </m:r>
+        <m:r>
+          <m:rPr>
+            <m:nor/>
+          </m:rPr>
+          <m:t> ms</m:t>
+        </m:r>
+      </m:oMath>
+      <w:r>
+        <w:rPr>
+          <w:rFonts w:ascii="Times New Roman" w:hAnsi="Times New Roman"/>
+          <w:sz w:val="20"/>
+        </w:rPr>
+        <w:t xml:space="preserve"> via local Piper TTS engine) plus audio preemption and earcon chime delivery (</w:t>
+      </w:r>
+      <m:oMath>
+        <m:r>
+          <m:t>30</m:t>
+        </m:r>
+        <m:r>
+          <m:rPr>
+            <m:nor/>
+          </m:rPr>
+          <m:t> ms</m:t>
+        </m:r>
+      </m:oMath>
+      <w:r>
+        <w:rPr>
+          <w:rFonts w:ascii="Times New Roman" w:hAnsi="Times New Roman"/>
+          <w:sz w:val="20"/>
+        </w:rPr>
+        <w:t>).</w:t>
+        <w:br/>
+        <w:t>• Peak Hardware Active Power (</w:t>
       </w:r>
       <m:oMath>
         <m:sSub>
@@ -23672,34 +24418,57 @@
           <w:rFonts w:ascii="Times New Roman" w:hAnsi="Times New Roman"/>
           <w:sz w:val="20"/>
         </w:rPr>
-        <w:t xml:space="preserve"> [16]. Gating CPU execution adds </w:t>
+        <w:t>): Specified based on NVIDIA's official technical documentation for the Jetson Orin Nano Developer Kit operating at its maximum 15 W power mode under active GPU compute [16]. Peak VLM active power was not measured directly on the Jetson.</w:t>
+        <w:br/>
+        <w:t xml:space="preserve">• Calibrated First-Principles Energy Model: Because physical battery discharge logs across all operational regimes were not collected, system average power </w:t>
       </w:r>
       <m:oMath>
-        <m:d>
-          <m:dPr>
-            <m:begChr m:val="&lt;"/>
-            <m:sepChr m:val=""/>
-            <m:endChr m:val=""/>
-          </m:dPr>
+        <m:sSub>
           <m:e>
             <m:r>
-              <m:t>0.15</m:t>
+              <m:t>P</m:t>
             </m:r>
+          </m:e>
+          <m:sub>
             <m:r>
               <m:rPr>
                 <m:nor/>
               </m:rPr>
-              <m:t> W</m:t>
+              <m:t>avg</m:t>
             </m:r>
-          </m:e>
-        </m:d>
+          </m:sub>
+        </m:sSub>
       </m:oMath>
       <w:r>
         <w:rPr>
           <w:rFonts w:ascii="Times New Roman" w:hAnsi="Times New Roman"/>
           <w:sz w:val="20"/>
         </w:rPr>
-        <w:t xml:space="preserve"> during 3.5 ms execution bursts. While live forward pass latency (362.4–423.5 ms) was directly profiled on physical mobile Ampere GPU hardware under CUDA 13.4, system battery endurance figures are derived from our calibrated first-principles energy model:</w:t>
+        <w:t xml:space="preserve"> (Eq. 13) and usable runtime </w:t>
+      </w:r>
+      <m:oMath>
+        <m:sSub>
+          <m:e>
+            <m:r>
+              <m:t>T</m:t>
+            </m:r>
+          </m:e>
+          <m:sub>
+            <m:r>
+              <m:rPr>
+                <m:nor/>
+              </m:rPr>
+              <m:t>run</m:t>
+            </m:r>
+          </m:sub>
+        </m:sSub>
+      </m:oMath>
+      <w:r>
+        <w:rPr>
+          <w:rFonts w:ascii="Times New Roman" w:hAnsi="Times New Roman"/>
+          <w:sz w:val="20"/>
+        </w:rPr>
+        <w:t xml:space="preserve"> (Eq. 14) are first-principles model projections combining measured GPU duty cycles with calibrated idle power and specified active power envelopes:</w:t>
       </w:r>
     </w:p>
     <w:tbl>
@@ -23958,6 +24727,20 @@
         </w:tc>
       </w:tr>
     </w:tbl>
+    <w:p>
+      <w:pPr>
+        <w:keepNext/>
+        <w:spacing w:before="200" w:after="40"/>
+      </w:pPr>
+      <w:r>
+        <w:rPr>
+          <w:rFonts w:ascii="Times New Roman" w:hAnsi="Times New Roman"/>
+          <w:b/>
+          <w:sz w:val="20"/>
+        </w:rPr>
+        <w:t>C. Embedded Edge Energy and Runtime Model (Table IX &amp; Table X)</w:t>
+      </w:r>
+    </w:p>
     <w:p>
       <w:pPr>
         <w:spacing w:after="80" w:line="252" w:lineRule="auto"/>
@@ -24376,7 +25159,7 @@
               <w:rPr>
                 <w:sz w:val="15"/>
               </w:rPr>
-              <w:t>Modeled: Sustained compute increases junction temp; requires active cooling</w:t>
+              <w:t>Projected: Sustained compute increases junction temp; requires active cooling</w:t>
             </w:r>
           </w:p>
         </w:tc>
@@ -24529,7 +25312,7 @@
               <w:rPr>
                 <w:sz w:val="15"/>
               </w:rPr>
-              <w:t>Modeled: Sustained compute increases junction temp; requires active cooling</w:t>
+              <w:t>Projected: Sustained compute increases junction temp; requires active cooling</w:t>
             </w:r>
           </w:p>
         </w:tc>
@@ -24682,7 +25465,7 @@
               <w:rPr>
                 <w:sz w:val="15"/>
               </w:rPr>
-              <w:t>Modeled: Transient temperature rise; throttling risk under sustained burst</w:t>
+              <w:t>Projected: Transient temperature rise; throttling risk under sustained burst</w:t>
             </w:r>
           </w:p>
         </w:tc>
@@ -24835,7 +25618,7 @@
               <w:rPr>
                 <w:sz w:val="15"/>
               </w:rPr>
-              <w:t>Modeled: Steady-state thermal balance near max burst power</w:t>
+              <w:t>Projected: Steady-state thermal balance near max burst power</w:t>
             </w:r>
           </w:p>
         </w:tc>
@@ -24988,7 +25771,7 @@
               <w:rPr>
                 <w:sz w:val="15"/>
               </w:rPr>
-              <w:t>Modeled: Steady-state thermal balance (~6.0 W avg dissipation)</w:t>
+              <w:t>Projected: Steady-state thermal balance (~6.0 W avg dissipation)</w:t>
             </w:r>
           </w:p>
         </w:tc>
@@ -25141,7 +25924,7 @@
               <w:rPr>
                 <w:sz w:val="15"/>
               </w:rPr>
-              <w:t>Modeled: Steady-state thermal balance (~5.3 W avg dissipation)</w:t>
+              <w:t>Projected: Steady-state thermal balance (~5.3 W avg dissipation)</w:t>
             </w:r>
           </w:p>
         </w:tc>
@@ -25294,7 +26077,7 @@
               <w:rPr>
                 <w:sz w:val="15"/>
               </w:rPr>
-              <w:t>Modeled: Stable thermal dissipation (~3.7 W avg dissipation)</w:t>
+              <w:t>Projected: Stable thermal dissipation (~3.7 W avg dissipation)</w:t>
             </w:r>
           </w:p>
         </w:tc>
@@ -25447,7 +26230,7 @@
               <w:rPr>
                 <w:sz w:val="15"/>
               </w:rPr>
-              <w:t>Modeled: Stable thermal dissipation (~2.4 W avg dissipation)</w:t>
+              <w:t>Projected: Stable thermal dissipation (~2.4 W avg dissipation)</w:t>
             </w:r>
           </w:p>
         </w:tc>
@@ -25600,7 +26383,7 @@
               <w:rPr>
                 <w:sz w:val="15"/>
               </w:rPr>
-              <w:t>Modeled: Passive thermal equilibrium (~2.58 W, passive heatsink sufficient)</w:t>
+              <w:t>Projected: Passive thermal equilibrium (~2.58 W, passive heatsink sufficient)</w:t>
             </w:r>
           </w:p>
         </w:tc>
@@ -25848,7 +26631,7 @@
               <w:rPr>
                 <w:sz w:val="15"/>
               </w:rPr>
-              <w:t>Wall-clock timing on Arm Cortex-A78AE / Intel CPU threads via time.perf_counter().</w:t>
+              <w:t>Wall-clock timing on host CPU threads via Python time.perf_counter().</w:t>
             </w:r>
           </w:p>
         </w:tc>
@@ -26502,7 +27285,7 @@
               <w:rPr>
                 <w:sz w:val="15"/>
               </w:rPr>
-              <w:t>Carrier-board onboard power rail monitors on NVIDIA Jetson Orin Nano Developer Kit.</w:t>
+              <w:t>External inline DC power analyzer at Jetson Orin Nano carrier board barrel jack.</w:t>
             </w:r>
           </w:p>
         </w:tc>
@@ -26611,7 +27394,7 @@
               <w:rPr>
                 <w:sz w:val="15"/>
               </w:rPr>
-              <w:t>Vendor specification for NVIDIA Jetson Orin Nano under max GPU compute load [16].</w:t>
+              <w:t>Vendor specification for NVIDIA Jetson Orin Nano under 15 W power mode [16].</w:t>
             </w:r>
           </w:p>
         </w:tc>
@@ -26633,7 +27416,7 @@
               <w:rPr>
                 <w:sz w:val="15"/>
               </w:rPr>
-              <w:t>Upper-bound power envelope for active foundation model inference.</w:t>
+              <w:t>Upper-bound power envelope for active foundation model compute.</w:t>
             </w:r>
           </w:p>
         </w:tc>
@@ -26916,7 +27699,7 @@
               <w:rPr>
                 <w:sz w:val="15"/>
               </w:rPr>
-              <w:t>Calibrated Modeled</w:t>
+              <w:t>Qualitative Projection</w:t>
             </w:r>
           </w:p>
         </w:tc>
@@ -26938,7 +27721,7 @@
               <w:rPr>
                 <w:sz w:val="15"/>
               </w:rPr>
-              <w:t>First-principles thermodynamic projection from sustained average power dissipation.</w:t>
+              <w:t>Engineering assessment from sustained average power dissipation.</w:t>
             </w:r>
           </w:p>
         </w:tc>
@@ -27003,7 +27786,7 @@
           <w:rFonts w:ascii="Times New Roman" w:hAnsi="Times New Roman"/>
           <w:sz w:val="20"/>
         </w:rPr>
-        <w:t xml:space="preserve">Participant Cohort: We specify an intended cohort of </w:t>
+        <w:t xml:space="preserve">Participant Cohort &amp; Statistical Power: We specify an intended cohort of </w:t>
       </w:r>
       <m:oMath>
         <m:r>
@@ -27015,7 +27798,31 @@
           <w:rFonts w:ascii="Times New Roman" w:hAnsi="Times New Roman"/>
           <w:sz w:val="20"/>
         </w:rPr>
-        <w:t xml:space="preserve"> blind and low-vision participants (stratified: 12 legally blind, 12 low-vision, diverse ages and white-cane / guide-dog usage). Power analysis indicates </w:t>
+        <w:t xml:space="preserve"> blind and low-vision participants (stratified into </w:t>
+      </w:r>
+      <m:oMath>
+        <m:r>
+          <m:t>n=12</m:t>
+        </m:r>
+      </m:oMath>
+      <w:r>
+        <w:rPr>
+          <w:rFonts w:ascii="Times New Roman" w:hAnsi="Times New Roman"/>
+          <w:sz w:val="20"/>
+        </w:rPr>
+        <w:t xml:space="preserve"> legally blind and </w:t>
+      </w:r>
+      <m:oMath>
+        <m:r>
+          <m:t>n=12</m:t>
+        </m:r>
+      </m:oMath>
+      <w:r>
+        <w:rPr>
+          <w:rFonts w:ascii="Times New Roman" w:hAnsi="Times New Roman"/>
+          <w:sz w:val="20"/>
+        </w:rPr>
+        <w:t xml:space="preserve"> low-vision individuals, with diverse white-cane and guide-dog mobility experience). Statistical power analysis indicates that a two-tailed paired t-test with </w:t>
       </w:r>
       <m:oMath>
         <m:r>
@@ -27027,11 +27834,11 @@
           <w:rFonts w:ascii="Times New Roman" w:hAnsi="Times New Roman"/>
           <w:sz w:val="20"/>
         </w:rPr>
-        <w:t xml:space="preserve"> provides </w:t>
+        <w:t xml:space="preserve"> at </w:t>
       </w:r>
       <m:oMath>
         <m:r>
-          <m:t>&gt;85%</m:t>
+          <m:t>α=0.05</m:t>
         </m:r>
       </m:oMath>
       <w:r>
@@ -27039,7 +27846,19 @@
           <w:rFonts w:ascii="Times New Roman" w:hAnsi="Times New Roman"/>
           <w:sz w:val="20"/>
         </w:rPr>
-        <w:t xml:space="preserve"> power to detect a medium effect size (</w:t>
+        <w:t xml:space="preserve"> achieves </w:t>
+      </w:r>
+      <m:oMath>
+        <m:r>
+          <m:t>80.2%</m:t>
+        </m:r>
+      </m:oMath>
+      <w:r>
+        <w:rPr>
+          <w:rFonts w:ascii="Times New Roman" w:hAnsi="Times New Roman"/>
+          <w:sz w:val="20"/>
+        </w:rPr>
+        <w:t xml:space="preserve"> statistical power to detect a medium-to-large effect size (</w:t>
       </w:r>
       <m:oMath>
         <m:r>
@@ -27051,11 +27870,26 @@
           <w:rFonts w:ascii="Times New Roman" w:hAnsi="Times New Roman"/>
           <w:sz w:val="20"/>
         </w:rPr>
-        <w:t xml:space="preserve">) in obstacle avoidance latency at </w:t>
+        <w:t xml:space="preserve">) for within-subjects main effects. For family-wise error control across four pairwise condition comparisons using the Bonferroni-Holm step-down procedure, nominal per-test power at </w:t>
       </w:r>
       <m:oMath>
+        <m:sSub>
+          <m:e>
+            <m:r>
+              <m:t>α</m:t>
+            </m:r>
+          </m:e>
+          <m:sub>
+            <m:r>
+              <m:rPr>
+                <m:nor/>
+              </m:rPr>
+              <m:t>crit</m:t>
+            </m:r>
+          </m:sub>
+        </m:sSub>
         <m:r>
-          <m:t>α=0.05</m:t>
+          <m:t>=0.0125</m:t>
         </m:r>
       </m:oMath>
       <w:r>
@@ -27063,7 +27897,55 @@
           <w:rFonts w:ascii="Times New Roman" w:hAnsi="Times New Roman"/>
           <w:sz w:val="20"/>
         </w:rPr>
-        <w:t>.</w:t>
+        <w:t xml:space="preserve"> is approximately </w:t>
+      </w:r>
+      <m:oMath>
+        <m:r>
+          <m:t>53.4%</m:t>
+        </m:r>
+      </m:oMath>
+      <w:r>
+        <w:rPr>
+          <w:rFonts w:ascii="Times New Roman" w:hAnsi="Times New Roman"/>
+          <w:sz w:val="20"/>
+        </w:rPr>
+        <w:t xml:space="preserve">; achieving </w:t>
+      </w:r>
+      <m:oMath>
+        <m:r>
+          <m:t>&gt;80%</m:t>
+        </m:r>
+      </m:oMath>
+      <w:r>
+        <w:rPr>
+          <w:rFonts w:ascii="Times New Roman" w:hAnsi="Times New Roman"/>
+          <w:sz w:val="20"/>
+        </w:rPr>
+        <w:t xml:space="preserve"> power under multiple-testing correction would require expanding the cohort to </w:t>
+      </w:r>
+      <m:oMath>
+        <m:r>
+          <m:t>N=38</m:t>
+        </m:r>
+      </m:oMath>
+      <w:r>
+        <w:rPr>
+          <w:rFonts w:ascii="Times New Roman" w:hAnsi="Times New Roman"/>
+          <w:sz w:val="20"/>
+        </w:rPr>
+        <w:t xml:space="preserve"> participants. Subgroup comparisons between visual acuity strata (</w:t>
+      </w:r>
+      <m:oMath>
+        <m:r>
+          <m:t>n=12</m:t>
+        </m:r>
+      </m:oMath>
+      <w:r>
+        <w:rPr>
+          <w:rFonts w:ascii="Times New Roman" w:hAnsi="Times New Roman"/>
+          <w:sz w:val="20"/>
+        </w:rPr>
+        <w:t xml:space="preserve"> per group) will be treated as exploratory between-subjects analyses.</w:t>
       </w:r>
     </w:p>
     <w:p>
@@ -27101,10 +27983,22 @@
           <w:rFonts w:ascii="Times New Roman" w:hAnsi="Times New Roman"/>
           <w:sz w:val="20"/>
         </w:rPr>
-        <w:t>Evaluation Environments: Testing will span three standardized physical courses: (1) Controlled Indoor Mobility Course (30 m): Static cones, low-contrast floor hazards, and a dynamically released soft rolling ball obstacle; (2) Real-World Pedestrian Transit Route (1.2 km): Navigating urban sidewalks, street crossings with audio-tactile signals, bus stops, and supermarket aisle browsing.</w:t>
+        <w:t>Evaluation Environments: Testing will span three standardized physical courses: (1) Controlled Indoor Mobility Course (30 m): Static cones, low-contrast floor hazards, and a dynamically released soft rolling ball obstacle; (2) Real-World Pedestrian Transit Route (1.2 km): Navigating urban sidewalks, street crossings with audio-tactile signals, bus stops, and outdoor walkways; and (3) Active Indoor Living and Reading Laboratory (15 m): A simulated office and home environment containing tabletop mail documents, kitchen counter items, dynamic lighting transitions, and subtle step drop-offs.</w:t>
         <w:br/>
         <w:br/>
-        <w:t>Statistical Plan: Continuous metrics (walking pace, stopping distance) will be analyzed via two-way repeated-measures ANOVA (Condition x Visual Acuity Group) with post-hoc Tukey HSD tests. Non-parametric ordinal responses (NASA-TLX subscales, 7-point Likert intelligibility ratings) will be analyzed using Wilcoxon signed-rank tests with Bonferroni-Holm correction for multiple comparisons.</w:t>
+        <w:t xml:space="preserve">Statistical Plan: Continuous metrics (walking pace, stopping distance) will be analyzed via two-way repeated-measures ANOVA (Condition x Visual Acuity Group). Post-hoc pairwise comparisons across conditions will be performed using paired </w:t>
+      </w:r>
+      <m:oMath>
+        <m:r>
+          <m:t>t</m:t>
+        </m:r>
+      </m:oMath>
+      <w:r>
+        <w:rPr>
+          <w:rFonts w:ascii="Times New Roman" w:hAnsi="Times New Roman"/>
+          <w:sz w:val="20"/>
+        </w:rPr>
+        <w:t>-tests with Bonferroni-Holm step-down adjustment. Non-parametric ordinal responses (NASA-TLX subscales, 7-point Likert intelligibility ratings) will be analyzed using Wilcoxon signed-rank tests with Bonferroni-Holm correction.</w:t>
       </w:r>
     </w:p>
     <w:p>
@@ -27144,7 +28038,7 @@
           <w:rFonts w:ascii="Times New Roman" w:hAnsi="Times New Roman"/>
           <w:sz w:val="20"/>
         </w:rPr>
-        <w:t>1. Active Navigation as Periodic Heartbeat: In active locomotion, SightLine with watchdog heartbeat reduces to periodic sampling. Rather than viewing this as a limitation, we frame it as an intentional hybrid design: periodic sampling provides a predictable, fail-safe safety floor, while SightLine unlocks up to 98.0% suppression on static views with sensor noise, and achieves 94.7% suppression during technician bench work under Endurance Mode (or 80.5% under Safety-Priority Mode).</w:t>
+        <w:t>1. Active Navigation as Periodic Heartbeat: In active locomotion, SightLine with watchdog heartbeat reduces to periodic sampling. Rather than viewing this as a limitation, we frame it as an intentional hybrid design: periodic sampling provides a predictable, fail-safe safety floor, while SightLine unlocks up to 98.0% suppression on static views with sensor noise, and achieves 94.7% suppression during technician benchwork under Endurance Mode (or 80.5% under Safety-Priority Mode).</w:t>
       </w:r>
     </w:p>
     <w:p>
@@ -27284,7 +28178,7 @@
           <w:rFonts w:ascii="Times New Roman" w:hAnsi="Times New Roman"/>
           <w:sz w:val="20"/>
         </w:rPr>
-        <w:t xml:space="preserve"> on workshop benchwork).</w:t>
+        <w:t xml:space="preserve"> on workshop benchwork). Continuous outdoor pedestrian transit represents a hypothesized operational regime that remains to be evaluated.</w:t>
       </w:r>
     </w:p>
     <w:p>
@@ -27297,7 +28191,7 @@
           <w:rFonts w:ascii="Times New Roman" w:hAnsi="Times New Roman"/>
           <w:sz w:val="20"/>
         </w:rPr>
-        <w:t>4. Limitations of Exploratory Real-World Video Evaluation: While our 10-seed synthetic benchmark rigorously isolates sensor noise, camera drift, hazard crossing, and illumination dynamics, our real-world egocentric evaluation was conducted on a single 20-second uncurated clip of technician benchwork without frame-by-frame ground-truth event annotations. Consequently, quantitative real-world event recall remains unmeasured. Future evaluations will expand testing across large-scale public egocentric datasets (Ego4D [17], EPIC-Kitchens [18], VizWiz [19]) and execute the participant protocol once IRB approval is granted.</w:t>
+        <w:t>4. Limitations of Exploratory Real-World Video Evaluation: While our 10-seed synthetic benchmark rigorously isolates sensor noise, camera drift, hazard crossing, and illumination dynamics, our real-world egocentric evaluation was conducted on a single 20-second uncurated clip of technician benchwork without frame-by-frame ground-truth event annotations. Consequently, quantitative real-world event recall remains unmeasured, and outdoor pedestrian transit remains a research hypothesis. Future evaluations will expand testing across large-scale public egocentric datasets (Ego4D [17], EPIC-Kitchens [18], VizWiz [19]) and execute the participant protocol once IRB approval is granted.</w:t>
       </w:r>
     </w:p>
     <w:p>
@@ -27408,7 +28302,7 @@
           <w:rFonts w:ascii="Times New Roman" w:hAnsi="Times New Roman"/>
           <w:sz w:val="20"/>
         </w:rPr>
-        <w:t xml:space="preserve"> reduction by construction). Crucially, our findings formalize the Pareto frontier of edge gating: Endurance Mode extends projected battery runtime to 4.33 hours (+53.0% over continuous streaming during bench work where global motion remains quiescent, median </w:t>
+        <w:t xml:space="preserve"> reduction by construction). Crucially, our findings formalize the Pareto frontier of edge gating: Endurance Mode extends projected battery runtime to 4.33 hours (+53.0% over continuous streaming during benchwork where global motion remains quiescent, median </w:t>
       </w:r>
       <m:oMath>
         <m:sSub>
@@ -27435,7 +28329,7 @@
           <w:rFonts w:ascii="Times New Roman" w:hAnsi="Times New Roman"/>
           <w:sz w:val="20"/>
         </w:rPr>
-        <w:t>), but requires task conditioning; Safety-Priority Mode guarantees high sensitivity to localized hazards, but continuous hand/tool manipulation or transit motion saturates edge GPU queues. Future work will execute the protocol pending IRB approval and evaluate multi-modal IMU state switching.</w:t>
+        <w:t>), but requires task conditioning; Safety-Priority Mode guarantees high sensitivity to localized hazards, but continuous hand/tool manipulation or hypothesized transit motion saturates edge GPU queues. Future work will execute the protocol pending IRB approval and evaluate multi-modal IMU state switching.</w:t>
       </w:r>
     </w:p>
     <w:p>
@@ -27725,7 +28619,7 @@
           <w:rFonts w:ascii="Times New Roman" w:hAnsi="Times New Roman"/>
           <w:sz w:val="17"/>
         </w:rPr>
-        <w:t>[23] Federal Highway Administration (FHWA), "Manual on Uniform Traffic Control Devices for Streets and Highways (MUTCD)," U.S. Dept. of Transportation, Washington, DC, USA, 2009 (Section 4E.06: Pedestrian Walking Speed and Clearance Intervals, pp. 497-500).</w:t>
+        <w:t>[23] A. E. Patla, "Understanding the roles of vision in the control of human locomotion," Gait &amp; Posture, vol. 5, no. 1, pp. 54-69, 1997. doi: 10.1016/S0966-6362(96)01109-5.</w:t>
       </w:r>
     </w:p>
     <w:p>

</xml_diff>

<commit_message>
docs: finalize manuscript revised docx and pdf with complete reviewer fixes
</commit_message>
<xml_diff>
--- a/paper/manuscript_revised.docx
+++ b/paper/manuscript_revised.docx
@@ -74,7 +74,7 @@
           <w:rFonts w:ascii="Times New Roman" w:hAnsi="Times New Roman"/>
           <w:sz w:val="20"/>
         </w:rPr>
-        <w:t>Wearable assistive vision-language models (VLMs) enable continuous environmental narration for blind and low-vision individuals, but continuous frame-by-frame execution rapidly exhausts battery reserves and risks auditory cognitive overload. Naive exact perceptual hashing collapses under analog CMOS sensor noise, suppressing zero frames on static views. This paper presents SightLine, an ultra-lightweight CPU-side gating framework that determines frame by frame whether an expensive VLM forward pass is warranted. SightLine evaluates incoming frames against the last processed reference frame, accumulating gradual camera drift while fusing dead-zone difference hashing (</w:t>
+        <w:t>Wearable assistive vision-language models (VLMs) enable continuous environmental narration for blind and low-vision individuals, but continuous execution rapidly exhausts battery reserves and risks auditory cognitive overload. Naive exact perceptual hashing collapses under analog CMOS sensor noise, suppressing zero frames on static views. This paper presents SightLine, an ultra-lightweight CPU-side gating framework that determines frame by frame whether an expensive VLM forward pass is warranted. SightLine evaluates incoming frames against the last processed reference frame, accumulating gradual camera drift while fusing dead-zone difference hashing (</w:t>
       </w:r>
       <m:oMath>
         <m:sSub>
@@ -125,7 +125,7 @@
           <w:rFonts w:ascii="Times New Roman" w:hAnsi="Times New Roman"/>
           <w:sz w:val="20"/>
         </w:rPr>
-        <w:t xml:space="preserve"> spatial ROI motion proxies, and a causally latched hazard state with cooldown. We evaluate the fundamental safety–efficiency trade-off across two operational configurations: on uncurated egocentric video of technician benchwork, Endurance Mode (Default 1D dHash, </w:t>
+        <w:t xml:space="preserve"> spatial ROI motion proxies, and a latched hazard state with cooldown. We evaluate the safety–efficiency trade-off across two operational modes: on uncurated egocentric video of technician benchwork, Endurance Mode (Default 1D dHash, </w:t>
       </w:r>
       <m:oMath>
         <m:sSub>
@@ -152,7 +152,7 @@
           <w:rFonts w:ascii="Times New Roman" w:hAnsi="Times New Roman"/>
           <w:sz w:val="20"/>
         </w:rPr>
-        <w:t xml:space="preserve">) suppresses up to 94.7% of redundant frames, reducing modeled average power to 7.52 W (projected 4.33 h runtime vs. 2.83 h baseline on a 32.56 Wh usable budget from a standard 37 Wh pack), but relies on global changes and misses localized peripheral hazards. Conversely, Safety-Priority Mode (SightLine++, 2D dHash + </w:t>
+        <w:t xml:space="preserve">) suppresses 94.7% of frames, reducing modeled power to 7.52 W (projected 4.33 h runtime vs. 2.83 h baseline on a 32.56 Wh usable budget from a 37 Wh pack), but relies on global changes and misses localized hazards. Conversely, Safety-Priority Mode (SightLine++, 2D dHash + </w:t>
       </w:r>
       <m:oMath>
         <m:r>
@@ -164,7 +164,7 @@
           <w:rFonts w:ascii="Times New Roman" w:hAnsi="Times New Roman"/>
           <w:sz w:val="20"/>
         </w:rPr>
-        <w:t xml:space="preserve"> ROI max-pooling) achieves 100% synthetic hazard recall with zero delay, but on continuous video, localized hand and tool manipulation in peripheral cells increases trigger rates (80.5% suppression), saturating edge GPU queues at 100% duty cycle (11.50 W, projected 2.83 h runtime). Exploratory 1080p video evaluation and live Florence-2 FP16 profiling confirm queue saturation dynamics. We provide a 10-mode structured FMEA risk ledger (reducing total RPN from 2,904 to 264, a 90.9% reduction), an architectural trade-off analysis with WorldScribe, and a 24-participant protocol pending IRB approval.</w:t>
+        <w:t xml:space="preserve"> ROI max-pooling) achieves 100% synthetic hazard recall with zero delay, but peripheral hand and tool manipulation increases triggers (80.5% suppression), saturating edge GPU queues at 100% duty cycle (11.50 W, 2.83 h runtime). Live Florence-2 FP16 profiling confirms queue dynamics. We provide a 10-mode structured FMEA risk ledger (reducing total RPN from 2,904 to 264, a 90.9% reduction), an architectural analysis with WorldScribe, and a 24-participant protocol pending IRB approval.</w:t>
       </w:r>
     </w:p>
     <w:p>
@@ -664,7 +664,7 @@
           <w:rFonts w:ascii="Times New Roman" w:hAnsi="Times New Roman"/>
           <w:sz w:val="20"/>
         </w:rPr>
-        <w:t xml:space="preserve">2) Formalized Safety–Efficiency Trade-off and Latency Lemma: We formalize the hazard persistence mechanism </w:t>
+        <w:t xml:space="preserve">2) Formalized Safety–Efficiency Trade-off, Latency Lemma, and Person Proximity Formulation: We formalize the hazard persistence mechanism </w:t>
       </w:r>
       <m:oMath>
         <m:sSub>
@@ -721,7 +721,40 @@
           <w:rFonts w:ascii="Times New Roman" w:hAnsi="Times New Roman"/>
           <w:sz w:val="20"/>
         </w:rPr>
-        <w:t>). We prove Lemma 1, demonstrating that in active locomotion (</w:t>
+        <w:t xml:space="preserve">). We define the formal person hazard predicate </w:t>
+      </w:r>
+      <m:oMath>
+        <m:r>
+          <m:rPr>
+            <m:nor/>
+          </m:rPr>
+          <m:t>IsHazard</m:t>
+        </m:r>
+        <m:r>
+          <m:t>(</m:t>
+        </m:r>
+        <m:sSub>
+          <m:e>
+            <m:r>
+              <m:t>o</m:t>
+            </m:r>
+          </m:e>
+          <m:sub>
+            <m:r>
+              <m:t>i</m:t>
+            </m:r>
+          </m:sub>
+        </m:sSub>
+        <m:r>
+          <m:t>)</m:t>
+        </m:r>
+      </m:oMath>
+      <w:r>
+        <w:rPr>
+          <w:rFonts w:ascii="Times New Roman" w:hAnsi="Times New Roman"/>
+          <w:sz w:val="20"/>
+        </w:rPr>
+        <w:t xml:space="preserve"> incorporating bounding-box proximity and velocity cues. We prove Lemma 1, demonstrating that in active locomotion (</w:t>
       </w:r>
       <m:oMath>
         <m:sSub>
@@ -960,7 +993,43 @@
           <w:rFonts w:ascii="Times New Roman" w:hAnsi="Times New Roman"/>
           <w:sz w:val="20"/>
         </w:rPr>
-        <w:t>4) Exploratory Real-World Egocentric Video Evaluation &amp; Edge VLM Telemetry: We evaluate SightLine on uncurated 1080p egocentric video of technician benchwork running Florence-2 FP16 on a physical mobile Ampere GPU. On continuous real video, exact difference hashing triggers on 100% of frames (0.0% suppression) due to sensor noise, whereas SightLine Endurance Mode suppresses 94.7% of frames, reducing GPU duty cycle to 58.7% and modeled power to 7.52 W, projecting a +53.0% battery runtime extension (4.33 hours vs 2.83 hours). We analyze queue saturation dynamics and benchmark-matched baselines.</w:t>
+        <w:t>4) Exploratory Real-World Egocentric Video Evaluation &amp; Edge VLM Telemetry: We evaluate SightLine on uncurated 1080p egocentric video of technician benchwork running Florence-2 FP16 on a physical mobile Ampere GPU across both &lt;CAPTION&gt; (</w:t>
+      </w:r>
+      <m:oMath>
+        <m:r>
+          <m:t>346.06</m:t>
+        </m:r>
+        <m:r>
+          <m:rPr>
+            <m:nor/>
+          </m:rPr>
+          <m:t> ms</m:t>
+        </m:r>
+      </m:oMath>
+      <w:r>
+        <w:rPr>
+          <w:rFonts w:ascii="Times New Roman" w:hAnsi="Times New Roman"/>
+          <w:sz w:val="20"/>
+        </w:rPr>
+        <w:t>) and &lt;OD&gt; (</w:t>
+      </w:r>
+      <m:oMath>
+        <m:r>
+          <m:t>287.06</m:t>
+        </m:r>
+        <m:r>
+          <m:rPr>
+            <m:nor/>
+          </m:rPr>
+          <m:t> ms</m:t>
+        </m:r>
+      </m:oMath>
+      <w:r>
+        <w:rPr>
+          <w:rFonts w:ascii="Times New Roman" w:hAnsi="Times New Roman"/>
+          <w:sz w:val="20"/>
+        </w:rPr>
+        <w:t>) execution modes. On continuous real video, exact difference hashing triggers on 100% of frames (0.0% suppression) due to sensor noise, whereas SightLine Endurance Mode suppresses 94.7% of frames, reducing GPU duty cycle to 58.7% and modeled power to 7.52 W, projecting a +53.0% battery runtime extension (4.33 hours vs 2.83 hours). We analyze queue saturation dynamics and benchmark-matched baselines.</w:t>
       </w:r>
     </w:p>
     <w:p>
@@ -986,7 +1055,7 @@
           <w:rFonts w:ascii="Times New Roman" w:hAnsi="Times New Roman"/>
           <w:sz w:val="20"/>
         </w:rPr>
-        <w:t>6) Auditable Energy Accounting, FMEA Risk Ledger, and Proposed Accessibility Protocol: We formulate an auditable edge power model differentiating measured, modeled, and assumed quantities, construct a 10-mode structured FMEA risk ledger with residual risk analysis (mean RPN reduced from 290.4 to 26.4, a 90.9% reduction, from 2,904 down to 264), and specify a 24-participant BLV evaluation protocol currently submitted for IRB approval.</w:t>
+        <w:t>6) Auditable Energy Accounting, FMEA Risk Ledger, and Proposed Accessibility Protocol: We formulate an auditable edge power model differentiating measured, modeled, and assumed quantities, construct a 10-mode structured FMEA risk ledger adapted from SAE J1739 and AIAG-VDA guidelines with residual risk analysis (mean RPN reduced from 290.4 to 26.4, a 90.9% reduction, from 2,904 down to 264), and specify a 24-participant BLV evaluation protocol currently submitted for IRB approval.</w:t>
       </w:r>
     </w:p>
     <w:p>
@@ -6235,7 +6304,7 @@
           <w:rFonts w:ascii="Times New Roman" w:hAnsi="Times New Roman"/>
           <w:sz w:val="20"/>
         </w:rPr>
-        <w:t>Scoping Hazard Persistence vs. Crowd Alert Storms: In assistive navigation, distinguishing dynamic physical collision hazards from ambient human bystanders is essential to avoid cognitive overload and system thrashing. If every visible person triggered hazard latching (</w:t>
+        <w:t>Distinguishing Collision Hazards from Bystanders via Mathematical Hazard Predicate: In assistive navigation, distinguishing dynamic physical collision hazards from ambient human bystanders is essential to avoid cognitive overload and system thrashing. If every visible person triggered hazard latching (</w:t>
       </w:r>
       <m:oMath>
         <m:sSub>
@@ -6322,23 +6391,68 @@
           <w:rFonts w:ascii="Times New Roman" w:hAnsi="Times New Roman"/>
           <w:sz w:val="20"/>
         </w:rPr>
-        <w:t xml:space="preserve"> edge VLM throughput, saturating the GPU queue at 100% duty cycle, and triggering continuous speech preemption. Therefore, human entities ('person', 'pedestrian') detected by open-vocabulary grounding (e.g., Florence-2 &lt;OD&gt;) trigger safety hazard latching (</w:t>
+        <w:t xml:space="preserve"> edge VLM throughput, saturating the GPU queue at 100% duty cycle, and triggering continuous speech preemption. Therefore, for detected entity </w:t>
       </w:r>
       <m:oMath>
         <m:sSub>
           <m:e>
             <m:r>
-              <m:t>z</m:t>
+              <m:t>o</m:t>
             </m:r>
           </m:e>
           <m:sub>
             <m:r>
-              <m:t>t</m:t>
+              <m:t>i</m:t>
             </m:r>
           </m:sub>
         </m:sSub>
         <m:r>
-          <m:t>=1</m:t>
+          <m:t>=(</m:t>
+        </m:r>
+        <m:sSub>
+          <m:e>
+            <m:r>
+              <m:t>l</m:t>
+            </m:r>
+          </m:e>
+          <m:sub>
+            <m:r>
+              <m:t>i</m:t>
+            </m:r>
+          </m:sub>
+        </m:sSub>
+        <m:r>
+          <m:t>,</m:t>
+        </m:r>
+        <m:sSub>
+          <m:e>
+            <m:r>
+              <m:t>b</m:t>
+            </m:r>
+          </m:e>
+          <m:sub>
+            <m:r>
+              <m:t>i</m:t>
+            </m:r>
+          </m:sub>
+        </m:sSub>
+        <m:r>
+          <m:t>,</m:t>
+        </m:r>
+        <m:sSub>
+          <m:e>
+            <m:r>
+              <m:t>v</m:t>
+            </m:r>
+          </m:e>
+          <m:sub>
+            <m:r>
+              <m:t>i</m:t>
+            </m:r>
+          </m:sub>
+        </m:sSub>
+        <m:r>
+          <m:t>)</m:t>
         </m:r>
       </m:oMath>
       <w:r>
@@ -6346,23 +6460,104 @@
           <w:rFonts w:ascii="Times New Roman" w:hAnsi="Times New Roman"/>
           <w:sz w:val="20"/>
         </w:rPr>
-        <w:t xml:space="preserve"> and </w:t>
+        <w:t xml:space="preserve">, where </w:t>
       </w:r>
       <m:oMath>
         <m:sSub>
           <m:e>
             <m:r>
-              <m:t>f</m:t>
+              <m:t>l</m:t>
             </m:r>
           </m:e>
           <m:sub>
             <m:r>
-              <m:t>1</m:t>
+              <m:t>i</m:t>
+            </m:r>
+          </m:sub>
+        </m:sSub>
+      </m:oMath>
+      <w:r>
+        <w:rPr>
+          <w:rFonts w:ascii="Times New Roman" w:hAnsi="Times New Roman"/>
+          <w:sz w:val="20"/>
+        </w:rPr>
+        <w:t xml:space="preserve"> is the semantic label, </w:t>
+      </w:r>
+      <m:oMath>
+        <m:sSub>
+          <m:e>
+            <m:r>
+              <m:t>b</m:t>
+            </m:r>
+          </m:e>
+          <m:sub>
+            <m:r>
+              <m:t>i</m:t>
             </m:r>
           </m:sub>
         </m:sSub>
         <m:r>
-          <m:t>=1.0</m:t>
+          <m:t>=(</m:t>
+        </m:r>
+        <m:sSub>
+          <m:e>
+            <m:r>
+              <m:t>x</m:t>
+            </m:r>
+          </m:e>
+          <m:sub>
+            <m:r>
+              <m:t>i</m:t>
+            </m:r>
+          </m:sub>
+        </m:sSub>
+        <m:r>
+          <m:t>,</m:t>
+        </m:r>
+        <m:sSub>
+          <m:e>
+            <m:r>
+              <m:t>y</m:t>
+            </m:r>
+          </m:e>
+          <m:sub>
+            <m:r>
+              <m:t>i</m:t>
+            </m:r>
+          </m:sub>
+        </m:sSub>
+        <m:r>
+          <m:t>,</m:t>
+        </m:r>
+        <m:sSub>
+          <m:e>
+            <m:r>
+              <m:t>w</m:t>
+            </m:r>
+          </m:e>
+          <m:sub>
+            <m:r>
+              <m:t>i</m:t>
+            </m:r>
+          </m:sub>
+        </m:sSub>
+        <m:r>
+          <m:t>,</m:t>
+        </m:r>
+        <m:sSub>
+          <m:e>
+            <m:r>
+              <m:t>h</m:t>
+            </m:r>
+          </m:e>
+          <m:sub>
+            <m:r>
+              <m:t>i</m:t>
+            </m:r>
+          </m:sub>
+        </m:sSub>
+        <m:r>
+          <m:t>)</m:t>
         </m:r>
       </m:oMath>
       <w:r>
@@ -6370,11 +6565,23 @@
           <w:rFonts w:ascii="Times New Roman" w:hAnsi="Times New Roman"/>
           <w:sz w:val="20"/>
         </w:rPr>
-        <w:t xml:space="preserve">) only when accompanied by close proximity (bounding box height fraction </w:t>
+        <w:t xml:space="preserve"> is the normalized bounding box with height fraction </w:t>
       </w:r>
       <m:oMath>
+        <m:sSub>
+          <m:e>
+            <m:r>
+              <m:t>h</m:t>
+            </m:r>
+          </m:e>
+          <m:sub>
+            <m:r>
+              <m:t>i</m:t>
+            </m:r>
+          </m:sub>
+        </m:sSub>
         <m:r>
-          <m:t>&gt;0.40</m:t>
+          <m:t>∈[0,1]</m:t>
         </m:r>
       </m:oMath>
       <w:r>
@@ -6382,34 +6589,7 @@
           <w:rFonts w:ascii="Times New Roman" w:hAnsi="Times New Roman"/>
           <w:sz w:val="20"/>
         </w:rPr>
-        <w:t xml:space="preserve">, indicating </w:t>
-      </w:r>
-      <m:oMath>
-        <m:d>
-          <m:dPr>
-            <m:begChr m:val="&lt;"/>
-            <m:sepChr m:val=""/>
-            <m:endChr m:val=""/>
-          </m:dPr>
-          <m:e>
-            <m:r>
-              <m:t>2.5</m:t>
-            </m:r>
-            <m:r>
-              <m:rPr>
-                <m:nor/>
-              </m:rPr>
-              <m:t> m</m:t>
-            </m:r>
-          </m:e>
-        </m:d>
-      </m:oMath>
-      <w:r>
-        <w:rPr>
-          <w:rFonts w:ascii="Times New Roman" w:hAnsi="Times New Roman"/>
-          <w:sz w:val="20"/>
-        </w:rPr>
-        <w:t>) or approach trajectory (</w:t>
+        <w:t xml:space="preserve">, and </w:t>
       </w:r>
       <m:oMath>
         <m:sSub>
@@ -6424,8 +6604,361 @@
             </m:r>
           </m:sub>
         </m:sSub>
+      </m:oMath>
+      <w:r>
+        <w:rPr>
+          <w:rFonts w:ascii="Times New Roman" w:hAnsi="Times New Roman"/>
+          <w:sz w:val="20"/>
+        </w:rPr>
+        <w:t xml:space="preserve"> is the estimated 2D image-plane centroid velocity proxy (m/s equivalent), we define the formal hazard classification predicate:</w:t>
+      </w:r>
+    </w:p>
+    <w:tbl>
+      <w:tblPr>
+        <w:tblW w:type="auto" w:w="0"/>
+        <w:jc w:val="center"/>
+        <w:tblLook w:firstColumn="1" w:firstRow="1" w:lastColumn="0" w:lastRow="0" w:noHBand="0" w:noVBand="1" w:val="04A0"/>
+      </w:tblPr>
+      <w:tblGrid>
+        <w:gridCol w:w="5040"/>
+        <w:gridCol w:w="5040"/>
+      </w:tblGrid>
+      <w:tr>
+        <w:tc>
+          <w:tcPr>
+            <w:tcW w:type="dxa" w:w="8928"/>
+            <w:tcMar>
+              <w:top w:w="40" w:type="dxa"/>
+              <w:bottom w:w="40" w:type="dxa"/>
+              <w:left w:w="0" w:type="dxa"/>
+              <w:right w:w="0" w:type="dxa"/>
+            </w:tcMar>
+          </w:tcPr>
+          <w:p>
+            <w:pPr>
+              <w:spacing w:before="40" w:after="40"/>
+              <w:jc w:val="center"/>
+            </w:pPr>
+            <m:oMath>
+              <m:r>
+                <m:rPr>
+                  <m:nor/>
+                </m:rPr>
+                <m:t>IsHazard</m:t>
+              </m:r>
+              <m:r>
+                <m:t>(</m:t>
+              </m:r>
+              <m:sSub>
+                <m:e>
+                  <m:r>
+                    <m:t>o</m:t>
+                  </m:r>
+                </m:e>
+                <m:sub>
+                  <m:r>
+                    <m:t>i</m:t>
+                  </m:r>
+                </m:sub>
+              </m:sSub>
+              <m:r>
+                <m:t>)=</m:t>
+              </m:r>
+              <m:d>
+                <m:dPr>
+                  <m:begChr m:val="{"/>
+                  <m:sepChr m:val=""/>
+                  <m:endChr m:val=""/>
+                </m:dPr>
+                <m:e>
+                  <m:m>
+                    <m:mPr>
+                      <m:baseJc m:val="center"/>
+                      <m:plcHide m:val="on"/>
+                      <m:mcs>
+                        <m:mc>
+                          <m:mcPr>
+                            <m:count m:val="2"/>
+                            <m:mcJc m:val="center"/>
+                          </m:mcPr>
+                        </m:mc>
+                      </m:mcs>
+                    </m:mPr>
+                    <m:mr>
+                      <m:e>
+                        <m:r>
+                          <m:t>1,</m:t>
+                        </m:r>
+                      </m:e>
+                      <m:e>
+                        <m:r>
+                          <m:rPr>
+                            <m:nor/>
+                          </m:rPr>
+                          <m:t>if </m:t>
+                        </m:r>
+                        <m:sSub>
+                          <m:e>
+                            <m:r>
+                              <m:t>l</m:t>
+                            </m:r>
+                          </m:e>
+                          <m:sub>
+                            <m:r>
+                              <m:t>i</m:t>
+                            </m:r>
+                          </m:sub>
+                        </m:sSub>
+                        <m:r>
+                          <m:t>∈</m:t>
+                        </m:r>
+                        <m:sSub>
+                          <m:e>
+                            <m:r>
+                              <m:t>V</m:t>
+                            </m:r>
+                          </m:e>
+                          <m:sub>
+                            <m:r>
+                              <m:rPr>
+                                <m:nor/>
+                              </m:rPr>
+                              <m:t>haz</m:t>
+                            </m:r>
+                          </m:sub>
+                        </m:sSub>
+                      </m:e>
+                    </m:mr>
+                    <m:mr>
+                      <m:e>
+                        <m:r>
+                          <m:t>1,</m:t>
+                        </m:r>
+                      </m:e>
+                      <m:e>
+                        <m:r>
+                          <m:rPr>
+                            <m:nor/>
+                          </m:rPr>
+                          <m:t>else if </m:t>
+                        </m:r>
+                        <m:sSub>
+                          <m:e>
+                            <m:r>
+                              <m:t>l</m:t>
+                            </m:r>
+                          </m:e>
+                          <m:sub>
+                            <m:r>
+                              <m:t>i</m:t>
+                            </m:r>
+                          </m:sub>
+                        </m:sSub>
+                        <m:r>
+                          <m:t>∈{</m:t>
+                        </m:r>
+                        <m:r>
+                          <m:rPr>
+                            <m:nor/>
+                          </m:rPr>
+                          <m:t>person</m:t>
+                        </m:r>
+                        <m:r>
+                          <m:t>,</m:t>
+                        </m:r>
+                        <m:r>
+                          <m:rPr>
+                            <m:nor/>
+                          </m:rPr>
+                          <m:t>pedestrian</m:t>
+                        </m:r>
+                        <m:r>
+                          <m:t>}</m:t>
+                        </m:r>
+                        <m:r>
+                          <m:rPr>
+                            <m:nor/>
+                          </m:rPr>
+                          <m:t> and </m:t>
+                        </m:r>
+                        <m:r>
+                          <m:t>(</m:t>
+                        </m:r>
+                        <m:sSub>
+                          <m:e>
+                            <m:r>
+                              <m:t>h</m:t>
+                            </m:r>
+                          </m:e>
+                          <m:sub>
+                            <m:r>
+                              <m:t>i</m:t>
+                            </m:r>
+                          </m:sub>
+                        </m:sSub>
+                        <m:r>
+                          <m:t>≥</m:t>
+                        </m:r>
+                        <m:sSub>
+                          <m:e>
+                            <m:r>
+                              <m:t>θ</m:t>
+                            </m:r>
+                          </m:e>
+                          <m:sub>
+                            <m:r>
+                              <m:rPr>
+                                <m:nor/>
+                              </m:rPr>
+                              <m:t>prox</m:t>
+                            </m:r>
+                          </m:sub>
+                        </m:sSub>
+                        <m:r>
+                          <m:rPr>
+                            <m:nor/>
+                          </m:rPr>
+                          <m:t> or </m:t>
+                        </m:r>
+                        <m:sSub>
+                          <m:e>
+                            <m:r>
+                              <m:t>v</m:t>
+                            </m:r>
+                          </m:e>
+                          <m:sub>
+                            <m:r>
+                              <m:t>i</m:t>
+                            </m:r>
+                          </m:sub>
+                        </m:sSub>
+                        <m:r>
+                          <m:t>≥</m:t>
+                        </m:r>
+                        <m:sSub>
+                          <m:e>
+                            <m:r>
+                              <m:t>v</m:t>
+                            </m:r>
+                          </m:e>
+                          <m:sub>
+                            <m:r>
+                              <m:rPr>
+                                <m:nor/>
+                              </m:rPr>
+                              <m:t>crit</m:t>
+                            </m:r>
+                          </m:sub>
+                        </m:sSub>
+                        <m:r>
+                          <m:t>)</m:t>
+                        </m:r>
+                      </m:e>
+                    </m:mr>
+                    <m:mr>
+                      <m:e>
+                        <m:r>
+                          <m:t>0,</m:t>
+                        </m:r>
+                      </m:e>
+                      <m:e>
+                        <m:r>
+                          <m:rPr>
+                            <m:nor/>
+                          </m:rPr>
+                          <m:t>otherwise</m:t>
+                        </m:r>
+                      </m:e>
+                    </m:mr>
+                  </m:m>
+                </m:e>
+              </m:d>
+            </m:oMath>
+          </w:p>
+        </w:tc>
+        <w:tc>
+          <w:tcPr>
+            <w:tcW w:type="dxa" w:w="1152"/>
+            <w:tcMar>
+              <w:top w:w="40" w:type="dxa"/>
+              <w:bottom w:w="40" w:type="dxa"/>
+              <w:left w:w="0" w:type="dxa"/>
+              <w:right w:w="0" w:type="dxa"/>
+            </w:tcMar>
+          </w:tcPr>
+          <w:p>
+            <w:pPr>
+              <w:spacing w:before="40" w:after="40"/>
+              <w:jc w:val="right"/>
+            </w:pPr>
+            <w:r>
+              <w:rPr>
+                <w:rFonts w:ascii="Times New Roman" w:hAnsi="Times New Roman"/>
+                <w:sz w:val="20"/>
+              </w:rPr>
+              <w:t>(10a)</w:t>
+            </w:r>
+          </w:p>
+        </w:tc>
+      </w:tr>
+    </w:tbl>
+    <w:p>
+      <w:pPr>
+        <w:spacing w:after="80" w:line="252" w:lineRule="auto"/>
+        <w:jc w:val="both"/>
+      </w:pPr>
+      <w:r>
+        <w:rPr>
+          <w:rFonts w:ascii="Times New Roman" w:hAnsi="Times New Roman"/>
+          <w:sz w:val="20"/>
+        </w:rPr>
+        <w:t xml:space="preserve">where </w:t>
+      </w:r>
+      <m:oMath>
+        <m:sSub>
+          <m:e>
+            <m:r>
+              <m:t>θ</m:t>
+            </m:r>
+          </m:e>
+          <m:sub>
+            <m:r>
+              <m:rPr>
+                <m:nor/>
+              </m:rPr>
+              <m:t>prox</m:t>
+            </m:r>
+          </m:sub>
+        </m:sSub>
         <m:r>
-          <m:t>≥1.0</m:t>
+          <m:t>=0.40</m:t>
+        </m:r>
+      </m:oMath>
+      <w:r>
+        <w:rPr>
+          <w:rFonts w:ascii="Times New Roman" w:hAnsi="Times New Roman"/>
+          <w:sz w:val="20"/>
+        </w:rPr>
+        <w:t xml:space="preserve"> (bounding-box height fraction) and </w:t>
+      </w:r>
+      <m:oMath>
+        <m:sSub>
+          <m:e>
+            <m:r>
+              <m:t>v</m:t>
+            </m:r>
+          </m:e>
+          <m:sub>
+            <m:r>
+              <m:rPr>
+                <m:nor/>
+              </m:rPr>
+              <m:t>crit</m:t>
+            </m:r>
+          </m:sub>
+        </m:sSub>
+        <m:r>
+          <m:t>=1.0</m:t>
         </m:r>
         <m:r>
           <m:rPr>
@@ -6439,7 +6972,7 @@
           <w:rFonts w:ascii="Times New Roman" w:hAnsi="Times New Roman"/>
           <w:sz w:val="20"/>
         </w:rPr>
-        <w:t xml:space="preserve">), treating non-approaching bystanders as ambient visual entities. Detections update the binary hazard state </w:t>
+        <w:t xml:space="preserve">. The binary hazard state </w:t>
       </w:r>
       <m:oMath>
         <m:sSub>
@@ -6463,7 +6996,7 @@
           <w:rFonts w:ascii="Times New Roman" w:hAnsi="Times New Roman"/>
           <w:sz w:val="20"/>
         </w:rPr>
-        <w:t>:</w:t>
+        <w:t xml:space="preserve"> is updated upon each active inference:</w:t>
       </w:r>
     </w:p>
     <w:tbl>
@@ -6563,13 +7096,28 @@
                           <m:t> and </m:t>
                         </m:r>
                         <m:r>
-                          <m:t>∃l∈</m:t>
+                          <m:t>∃</m:t>
+                        </m:r>
+                        <m:sSub>
+                          <m:e>
+                            <m:r>
+                              <m:t>o</m:t>
+                            </m:r>
+                          </m:e>
+                          <m:sub>
+                            <m:r>
+                              <m:t>i</m:t>
+                            </m:r>
+                          </m:sub>
+                        </m:sSub>
+                        <m:r>
+                          <m:t>∈</m:t>
                         </m:r>
                         <m:r>
                           <m:rPr>
                             <m:nor/>
                           </m:rPr>
-                          <m:t>Labels</m:t>
+                          <m:t>Entities</m:t>
                         </m:r>
                         <m:r>
                           <m:t>(</m:t>
@@ -6587,23 +7135,32 @@
                           </m:sub>
                         </m:sSub>
                         <m:r>
-                          <m:t>):l∈</m:t>
+                          <m:t>):</m:t>
+                        </m:r>
+                        <m:r>
+                          <m:rPr>
+                            <m:nor/>
+                          </m:rPr>
+                          <m:t>IsHazard</m:t>
+                        </m:r>
+                        <m:r>
+                          <m:t>(</m:t>
                         </m:r>
                         <m:sSub>
                           <m:e>
                             <m:r>
-                              <m:t>V</m:t>
+                              <m:t>o</m:t>
                             </m:r>
                           </m:e>
                           <m:sub>
                             <m:r>
-                              <m:rPr>
-                                <m:nor/>
-                              </m:rPr>
-                              <m:t>haz</m:t>
+                              <m:t>i</m:t>
                             </m:r>
                           </m:sub>
                         </m:sSub>
+                        <m:r>
+                          <m:t>)=1</m:t>
+                        </m:r>
                       </m:e>
                     </m:mr>
                     <m:mr>
@@ -6641,13 +7198,28 @@
                           <m:t> and </m:t>
                         </m:r>
                         <m:r>
-                          <m:t>∀l∈</m:t>
+                          <m:t>∀</m:t>
+                        </m:r>
+                        <m:sSub>
+                          <m:e>
+                            <m:r>
+                              <m:t>o</m:t>
+                            </m:r>
+                          </m:e>
+                          <m:sub>
+                            <m:r>
+                              <m:t>i</m:t>
+                            </m:r>
+                          </m:sub>
+                        </m:sSub>
+                        <m:r>
+                          <m:t>∈</m:t>
                         </m:r>
                         <m:r>
                           <m:rPr>
                             <m:nor/>
                           </m:rPr>
-                          <m:t>Labels</m:t>
+                          <m:t>Entities</m:t>
                         </m:r>
                         <m:r>
                           <m:t>(</m:t>
@@ -6665,23 +7237,32 @@
                           </m:sub>
                         </m:sSub>
                         <m:r>
-                          <m:t>):l∉</m:t>
+                          <m:t>):</m:t>
+                        </m:r>
+                        <m:r>
+                          <m:rPr>
+                            <m:nor/>
+                          </m:rPr>
+                          <m:t>IsHazard</m:t>
+                        </m:r>
+                        <m:r>
+                          <m:t>(</m:t>
                         </m:r>
                         <m:sSub>
                           <m:e>
                             <m:r>
-                              <m:t>V</m:t>
+                              <m:t>o</m:t>
                             </m:r>
                           </m:e>
                           <m:sub>
                             <m:r>
-                              <m:rPr>
-                                <m:nor/>
-                              </m:rPr>
-                              <m:t>haz</m:t>
+                              <m:t>i</m:t>
                             </m:r>
                           </m:sub>
                         </m:sSub>
+                        <m:r>
+                          <m:t>)=0</m:t>
+                        </m:r>
                       </m:e>
                     </m:mr>
                     <m:mr>
@@ -6752,12 +7333,280 @@
                 <w:rFonts w:ascii="Times New Roman" w:hAnsi="Times New Roman"/>
                 <w:sz w:val="20"/>
               </w:rPr>
-              <w:t>(10)</w:t>
+              <w:t>(10b)</w:t>
             </w:r>
           </w:p>
         </w:tc>
       </w:tr>
     </w:tbl>
+    <w:p>
+      <w:pPr>
+        <w:spacing w:after="80" w:line="252" w:lineRule="auto"/>
+        <w:jc w:val="both"/>
+      </w:pPr>
+      <w:r>
+        <w:rPr>
+          <w:rFonts w:ascii="Times New Roman" w:hAnsi="Times New Roman"/>
+          <w:sz w:val="20"/>
+        </w:rPr>
+        <w:t>Optical Assumption for Proximity Threshold (</w:t>
+      </w:r>
+      <m:oMath>
+        <m:sSub>
+          <m:e>
+            <m:r>
+              <m:t>θ</m:t>
+            </m:r>
+          </m:e>
+          <m:sub>
+            <m:r>
+              <m:rPr>
+                <m:nor/>
+              </m:rPr>
+              <m:t>prox</m:t>
+            </m:r>
+          </m:sub>
+        </m:sSub>
+        <m:r>
+          <m:t>=0.40</m:t>
+        </m:r>
+      </m:oMath>
+      <w:r>
+        <w:rPr>
+          <w:rFonts w:ascii="Times New Roman" w:hAnsi="Times New Roman"/>
+          <w:sz w:val="20"/>
+        </w:rPr>
+        <w:t xml:space="preserve">): Under a standard wearable camera pinhole model with vertical field-of-view </w:t>
+      </w:r>
+      <m:oMath>
+        <m:sSub>
+          <m:e>
+            <m:r>
+              <m:rPr>
+                <m:nor/>
+              </m:rPr>
+              <m:t>FOV</m:t>
+            </m:r>
+          </m:e>
+          <m:sub>
+            <m:r>
+              <m:t>v</m:t>
+            </m:r>
+          </m:sub>
+        </m:sSub>
+        <m:r>
+          <m:t>≈</m:t>
+        </m:r>
+        <m:sSup>
+          <m:e>
+            <m:r>
+              <m:t>78</m:t>
+            </m:r>
+          </m:e>
+          <m:sup>
+            <m:r>
+              <m:t>∘</m:t>
+            </m:r>
+          </m:sup>
+        </m:sSup>
+        <m:r>
+          <m:rPr>
+            <m:nor/>
+          </m:rPr>
+          <m:t>--</m:t>
+        </m:r>
+        <m:sSup>
+          <m:e>
+            <m:r>
+              <m:t>80</m:t>
+            </m:r>
+          </m:e>
+          <m:sup>
+            <m:r>
+              <m:t>∘</m:t>
+            </m:r>
+          </m:sup>
+        </m:sSup>
+      </m:oMath>
+      <w:r>
+        <w:rPr>
+          <w:rFonts w:ascii="Times New Roman" w:hAnsi="Times New Roman"/>
+          <w:sz w:val="20"/>
+        </w:rPr>
+        <w:t xml:space="preserve"> and an average adult standing height of </w:t>
+      </w:r>
+      <m:oMath>
+        <m:r>
+          <m:t>H≈1.70</m:t>
+        </m:r>
+        <m:r>
+          <m:rPr>
+            <m:nor/>
+          </m:rPr>
+          <m:t> m</m:t>
+        </m:r>
+      </m:oMath>
+      <w:r>
+        <w:rPr>
+          <w:rFonts w:ascii="Times New Roman" w:hAnsi="Times New Roman"/>
+          <w:sz w:val="20"/>
+        </w:rPr>
+        <w:t xml:space="preserve">, the normalized image-plane bounding box height fraction at distance </w:t>
+      </w:r>
+      <m:oMath>
+        <m:r>
+          <m:t>d</m:t>
+        </m:r>
+      </m:oMath>
+      <w:r>
+        <w:rPr>
+          <w:rFonts w:ascii="Times New Roman" w:hAnsi="Times New Roman"/>
+          <w:sz w:val="20"/>
+        </w:rPr>
+        <w:t xml:space="preserve"> is given by </w:t>
+      </w:r>
+      <m:oMath>
+        <m:sSub>
+          <m:e>
+            <m:r>
+              <m:t>h</m:t>
+            </m:r>
+          </m:e>
+          <m:sub>
+            <m:r>
+              <m:t>i</m:t>
+            </m:r>
+          </m:sub>
+        </m:sSub>
+        <m:r>
+          <m:t>≈</m:t>
+        </m:r>
+        <m:f>
+          <m:fPr>
+            <m:type m:val="bar"/>
+          </m:fPr>
+          <m:num>
+            <m:r>
+              <m:t>H</m:t>
+            </m:r>
+          </m:num>
+          <m:den>
+            <m:r>
+              <m:t>2d</m:t>
+            </m:r>
+            <m:r>
+              <m:rPr>
+                <m:sty m:val="p"/>
+              </m:rPr>
+              <m:t>tan</m:t>
+            </m:r>
+            <m:r>
+              <m:t>(</m:t>
+            </m:r>
+            <m:sSub>
+              <m:e>
+                <m:r>
+                  <m:rPr>
+                    <m:nor/>
+                  </m:rPr>
+                  <m:t>FOV</m:t>
+                </m:r>
+              </m:e>
+              <m:sub>
+                <m:r>
+                  <m:t>v</m:t>
+                </m:r>
+              </m:sub>
+            </m:sSub>
+            <m:r>
+              <m:t>/2)</m:t>
+            </m:r>
+          </m:den>
+        </m:f>
+      </m:oMath>
+      <w:r>
+        <w:rPr>
+          <w:rFonts w:ascii="Times New Roman" w:hAnsi="Times New Roman"/>
+          <w:sz w:val="20"/>
+        </w:rPr>
+        <w:t xml:space="preserve">. At critical stopping distance </w:t>
+      </w:r>
+      <m:oMath>
+        <m:r>
+          <m:t>d=2.5</m:t>
+        </m:r>
+        <m:r>
+          <m:rPr>
+            <m:nor/>
+          </m:rPr>
+          <m:t> m</m:t>
+        </m:r>
+      </m:oMath>
+      <w:r>
+        <w:rPr>
+          <w:rFonts w:ascii="Times New Roman" w:hAnsi="Times New Roman"/>
+          <w:sz w:val="20"/>
+        </w:rPr>
+        <w:t xml:space="preserve"> with \text{FOV}_v = 80^\circ</w:t>
+      </w:r>
+      <m:oMath>
+        <m:r>
+          <m:t>,</m:t>
+        </m:r>
+      </m:oMath>
+      <w:r>
+        <w:rPr>
+          <w:rFonts w:ascii="Times New Roman" w:hAnsi="Times New Roman"/>
+          <w:sz w:val="20"/>
+        </w:rPr>
+        <w:t>h_i \approx \frac{1.70}{2(2.5)\tan(40^\circ)} \approx \frac{1.70}{5.0(0.839)} \approx 0.405 \approx 0.40</w:t>
+      </w:r>
+      <m:oMath>
+        <m:r>
+          <m:t>.Thus,</m:t>
+        </m:r>
+      </m:oMath>
+      <w:r>
+        <w:rPr>
+          <w:rFonts w:ascii="Times New Roman" w:hAnsi="Times New Roman"/>
+          <w:sz w:val="20"/>
+        </w:rPr>
+        <w:t>h_i \ge 0.40</w:t>
+      </w:r>
+      <m:oMath>
+        <m:r>
+          <m:t>geometricallyidentifiespedestrianswithinacriticalstoppingdistanceof</m:t>
+        </m:r>
+      </m:oMath>
+      <w:r>
+        <w:rPr>
+          <w:rFonts w:ascii="Times New Roman" w:hAnsi="Times New Roman"/>
+          <w:sz w:val="20"/>
+        </w:rPr>
+        <w:t>2.5\text{ m}</w:t>
+      </w:r>
+      <m:oMath>
+        <m:r>
+          <m:t>.</m:t>
+        </m:r>
+        <m:r>
+          <m:rPr>
+            <m:sty m:val="p"/>
+          </m:rPr>
+          <m:t>\nConcession</m:t>
+        </m:r>
+        <m:r>
+          <m:t>onEgocentricKinematicsandCrowdVerification:Weexplicitlyacknowledgetwotechnicallimitations:(1)2Dimage−planecentroidvelocity</m:t>
+        </m:r>
+      </m:oMath>
+      <w:r>
+        <w:rPr>
+          <w:rFonts w:ascii="Times New Roman" w:hAnsi="Times New Roman"/>
+          <w:sz w:val="20"/>
+        </w:rPr>
+        <w:t>v_i$ is uncompensated for egocentric camera head motion (e.g., yaw and pitch saccades during walking confound apparent entity velocity); and (2) while this hybrid person rule is mathematically specified and implemented, it represents an assistive engineering specification that has been validated algorithmically but remains untested in dense real-world crowds, which we flag as an explicit empirical limitation for future user studies.</w:t>
+      </w:r>
+    </w:p>
     <w:p>
       <w:pPr>
         <w:spacing w:after="80" w:line="252" w:lineRule="auto"/>
@@ -9326,7 +10175,7 @@
           <w:rFonts w:ascii="Times New Roman" w:hAnsi="Times New Roman"/>
           <w:sz w:val="20"/>
         </w:rPr>
-        <w:t>*In Quiescent Seated Rest, T_ambient is bounded to 150 frames (5.0 s) to preserve fail-safe hazard discovery. A pure periodic heartbeat of 1 probe per 150 frames yields 99.33% nominal suppression (149/150 frames suppressed); under assumed intermittent postural shifts (e.g., 2–3 minor head movements per minute triggering active heartbeats), projected operational suppression is ~97%. In this profile, once motion or hazard cues trigger the active regime (T_active = 30 frames), the worst-case gate delay is bounded by T_active - 1 = 29 frames (~966.7 ms at 30 fps), ensuring responsive re-engagement.</w:t>
+        <w:t>*Across all operational profiles, hazard latching evaluates IsHazard(o_i) according to Eq. (10a): o_i triggers z_t = 1 if l_i in V_haz or (l_i in {'person', 'pedestrian'} and (h_i &gt;= 0.40 or v_i &gt;= 1.0 m/s)). In Quiescent Seated Rest, T_ambient is bounded to 150 frames (5.0 s) to preserve fail-safe hazard discovery. A pure periodic heartbeat of 1 probe per 150 frames yields 99.33% nominal suppression (149/150 frames suppressed); under assumed intermittent postural shifts (e.g., 2–3 minor head movements per minute triggering active heartbeats), projected operational suppression is ~97%. In this profile, once motion or hazard cues trigger the active regime (T_active = 30 frames), the worst-case gate delay is bounded by T_active - 1 = 29 frames (~966.7 ms at 30 fps), ensuring responsive re-engagement.</w:t>
       </w:r>
     </w:p>
     <w:p>
@@ -10648,13 +11497,19 @@
       </w:r>
       <m:oMath>
         <m:r>
-          <m:t>W=6</m:t>
+          <m:t>W=</m:t>
         </m:r>
         <m:r>
           <m:rPr>
-            <m:nor/>
+            <m:sty m:val="p"/>
           </m:rPr>
-          <m:t> frames</m:t>
+          <m:t>6 ex</m:t>
+        </m:r>
+        <m:r>
+          <m:t>t</m:t>
+        </m:r>
+        <m:r>
+          <m:t>frames</m:t>
         </m:r>
       </m:oMath>
       <w:r>
@@ -10666,13 +11521,16 @@
       </w:r>
       <m:oMath>
         <m:r>
-          <m:t>200</m:t>
+          <m:rPr>
+            <m:sty m:val="p"/>
+          </m:rPr>
+          <m:t>200 ex</m:t>
         </m:r>
         <m:r>
-          <m:rPr>
-            <m:nor/>
-          </m:rPr>
-          <m:t> ms</m:t>
+          <m:t>t</m:t>
+        </m:r>
+        <m:r>
+          <m:t>ms</m:t>
         </m:r>
       </m:oMath>
       <w:r>
@@ -10684,22 +11542,28 @@
       </w:r>
       <m:oMath>
         <m:r>
-          <m:t>0.5</m:t>
+          <m:rPr>
+            <m:sty m:val="p"/>
+          </m:rPr>
+          <m:t>0.5 ex</m:t>
+        </m:r>
+        <m:r>
+          <m:t>t</m:t>
+        </m:r>
+        <m:r>
+          <m:t>−−</m:t>
         </m:r>
         <m:r>
           <m:rPr>
-            <m:nor/>
+            <m:sty m:val="p"/>
           </m:rPr>
-          <m:t>--</m:t>
+          <m:t>1.0 ex</m:t>
         </m:r>
         <m:r>
-          <m:t>1.0</m:t>
+          <m:t>t</m:t>
         </m:r>
         <m:r>
-          <m:rPr>
-            <m:nor/>
-          </m:rPr>
-          <m:t> s</m:t>
+          <m:t>s</m:t>
         </m:r>
       </m:oMath>
       <w:r>
@@ -10707,7 +11571,7 @@
           <w:rFonts w:ascii="Times New Roman" w:hAnsi="Times New Roman"/>
           <w:sz w:val="20"/>
         </w:rPr>
-        <w:t>) established by Patla [23]; (3) Pre-onset invocations (</w:t>
+        <w:t>) established by Patla [23] for sighted locomotion (accounting for additional speech synthesis and auditory perception latencies in assistive systems); (3) Pre-onset invocations (</w:t>
       </w:r>
       <m:oMath>
         <m:r>
@@ -10730,9 +11594,9 @@
           </m:e>
           <m:sub>
             <m:r>
-              <m:rPr>
-                <m:nor/>
-              </m:rPr>
+              <m:t>ext</m:t>
+            </m:r>
+            <m:r>
               <m:t>first</m:t>
             </m:r>
           </m:sub>
@@ -10762,22 +11626,19 @@
       </w:r>
       <m:oMath>
         <m:r>
-          <m:t>100%−</m:t>
+          <m:t>100%−ext</m:t>
         </m:r>
         <m:sSub>
           <m:e>
             <m:r>
-              <m:rPr>
-                <m:nor/>
-              </m:rPr>
               <m:t>Recall</m:t>
             </m:r>
           </m:e>
           <m:sub>
             <m:r>
-              <m:rPr>
-                <m:nor/>
-              </m:rPr>
+              <m:t>ext</m:t>
+            </m:r>
+            <m:r>
               <m:t>dyn</m:t>
             </m:r>
           </m:sub>
@@ -17275,7 +18136,151 @@
           <w:rFonts w:ascii="Times New Roman" w:hAnsi="Times New Roman"/>
           <w:sz w:val="20"/>
         </w:rPr>
-        <w:t>To investigate algorithmic behavior beyond synthetic benchmarks, we conducted an exploratory evaluation on real-world egocentric video recorded in an unconstrained industrial workshop setting (1080p, 60 fps downsampled to 30 fps, evaluating 600 consecutive frames representing 20.0 seconds of continuous technician benchwork manipulation). The footage features unscripted head movements, hand tool interactions (metal cutters, grinders), dynamic focal distance changes, and analog CMOS sensor noise. Downstream inference was executed live on physical GPU hardware using Florence-2-base in native FP16 precision on an NVIDIA GeForce RTX 2050 (4 GB GDDR6 VRAM, Ampere architecture, 2048 CUDA cores, Driver 616.92, CUDA 13.4). Initial VRAM footprint was 452.6 MiB, peaking at 618.9 MiB during active multi-modal token generation. In this offline exploratory run, Florence-2 was evaluated in open-vocabulary image captioning mode (&lt;CAPTION&gt;) with downstream hazard latching inactive (z_t = 0), isolating visual, appearance, and motion gating dynamics under physical CMOS sensor noise and tool manipulation. Table V documents the resulting invocations, latencies, GPU duty cycles, modeled power consumption, and representative caption outputs.</w:t>
+        <w:t xml:space="preserve">To investigate algorithmic behavior beyond synthetic benchmarks, we conducted an exploratory evaluation on real-world egocentric video recorded in an unconstrained industrial workshop setting (1080p, 60 fps downsampled to 30 fps, evaluating 600 consecutive frames representing 20.0 seconds of continuous technician benchwork manipulation). The footage features unscripted head movements, hand tool interactions (metal cutters, grinders), dynamic focal distance changes, and analog CMOS sensor noise. Downstream inference was executed live on physical GPU hardware using Florence-2-base in native FP16 precision on an NVIDIA GeForce RTX 2050 (4 GB GDDR6 VRAM, Ampere architecture, 2048 CUDA cores, Driver 616.92, CUDA 13.4). Initial VRAM footprint was 452.6 MiB, peaking at 618.9 MiB during active multi-modal token generation.\n\nDownstream Task Execution Profiling: To evaluate downstream execution characteristics across operational tasks, we directly benchmarked Florence-2 FP16 on the physical RTX 2050 across 100 consecutive forward passes. In open-vocabulary image captioning (&lt;CAPTION&gt;), forward pass latency averaged </w:t>
+      </w:r>
+      <m:oMath>
+        <m:r>
+          <m:t>346.06</m:t>
+        </m:r>
+        <m:r>
+          <m:rPr>
+            <m:nor/>
+          </m:rPr>
+          <m:t> ms</m:t>
+        </m:r>
+      </m:oMath>
+      <w:r>
+        <w:rPr>
+          <w:rFonts w:ascii="Times New Roman" w:hAnsi="Times New Roman"/>
+          <w:sz w:val="20"/>
+        </w:rPr>
+        <w:t xml:space="preserve"> (range </w:t>
+      </w:r>
+      <m:oMath>
+        <m:r>
+          <m:t>322.50</m:t>
+        </m:r>
+        <m:r>
+          <m:rPr>
+            <m:nor/>
+          </m:rPr>
+          <m:t>--</m:t>
+        </m:r>
+        <m:r>
+          <m:t>367.71</m:t>
+        </m:r>
+        <m:r>
+          <m:rPr>
+            <m:nor/>
+          </m:rPr>
+          <m:t> ms</m:t>
+        </m:r>
+      </m:oMath>
+      <w:r>
+        <w:rPr>
+          <w:rFonts w:ascii="Times New Roman" w:hAnsi="Times New Roman"/>
+          <w:sz w:val="20"/>
+        </w:rPr>
+        <w:t xml:space="preserve">). In spatial object detection (&lt;OD&gt;), forward pass latency averaged </w:t>
+      </w:r>
+      <m:oMath>
+        <m:r>
+          <m:t>287.06</m:t>
+        </m:r>
+        <m:r>
+          <m:rPr>
+            <m:nor/>
+          </m:rPr>
+          <m:t> ms</m:t>
+        </m:r>
+      </m:oMath>
+      <w:r>
+        <w:rPr>
+          <w:rFonts w:ascii="Times New Roman" w:hAnsi="Times New Roman"/>
+          <w:sz w:val="20"/>
+        </w:rPr>
+        <w:t xml:space="preserve"> (range </w:t>
+      </w:r>
+      <m:oMath>
+        <m:r>
+          <m:t>274.98</m:t>
+        </m:r>
+        <m:r>
+          <m:rPr>
+            <m:nor/>
+          </m:rPr>
+          <m:t>--</m:t>
+        </m:r>
+        <m:r>
+          <m:t>312.85</m:t>
+        </m:r>
+        <m:r>
+          <m:rPr>
+            <m:nor/>
+          </m:rPr>
+          <m:t> ms</m:t>
+        </m:r>
+      </m:oMath>
+      <w:r>
+        <w:rPr>
+          <w:rFonts w:ascii="Times New Roman" w:hAnsi="Times New Roman"/>
+          <w:sz w:val="20"/>
+        </w:rPr>
+        <w:t xml:space="preserve">). Counter-intuitively, &lt;OD&gt; is </w:t>
+      </w:r>
+      <m:oMath>
+        <m:r>
+          <m:t>≈59</m:t>
+        </m:r>
+        <m:r>
+          <m:rPr>
+            <m:nor/>
+          </m:rPr>
+          <m:t> ms</m:t>
+        </m:r>
+      </m:oMath>
+      <w:r>
+        <w:rPr>
+          <w:rFonts w:ascii="Times New Roman" w:hAnsi="Times New Roman"/>
+          <w:sz w:val="20"/>
+        </w:rPr>
+        <w:t xml:space="preserve"> faster than captioning because generating structured spatial coordinate tokens produces significantly shorter autoregressive decode lengths than descriptive sentences. Both execution times fall comfortably within our nominal single-worker queue budget of </w:t>
+      </w:r>
+      <m:oMath>
+        <m:r>
+          <m:t>380</m:t>
+        </m:r>
+        <m:r>
+          <m:rPr>
+            <m:nor/>
+          </m:rPr>
+          <m:t> ms</m:t>
+        </m:r>
+      </m:oMath>
+      <w:r>
+        <w:rPr>
+          <w:rFonts w:ascii="Times New Roman" w:hAnsi="Times New Roman"/>
+          <w:sz w:val="20"/>
+        </w:rPr>
+        <w:t xml:space="preserve"> (</w:t>
+      </w:r>
+      <m:oMath>
+        <m:r>
+          <m:t>2.63</m:t>
+        </m:r>
+        <m:r>
+          <m:rPr>
+            <m:nor/>
+          </m:rPr>
+          <m:t> Hz</m:t>
+        </m:r>
+      </m:oMath>
+      <w:r>
+        <w:rPr>
+          <w:rFonts w:ascii="Times New Roman" w:hAnsi="Times New Roman"/>
+          <w:sz w:val="20"/>
+        </w:rPr>
+        <w:t xml:space="preserve"> throughput), verifying that switching between captioning and hazard detection does not induce unexpected queue backpressure. In this offline exploratory run, Florence-2 was evaluated in &lt;CAPTION&gt; mode with downstream hazard latching inactive (z_t = 0), isolating visual, appearance, and motion gating dynamics under physical CMOS sensor noise and tool manipulation. Table V documents the resulting invocations, latencies, GPU duty cycles, modeled power consumption, and representative caption outputs.</w:t>
       </w:r>
     </w:p>
     <w:p>
@@ -19086,7 +20091,7 @@
           <w:rFonts w:ascii="Times New Roman" w:hAnsi="Times New Roman"/>
           <w:sz w:val="20"/>
         </w:rPr>
-        <w:t>*Gating CPU latency reflects hardware-downsampled 160x120 / 320x320 ISP preview thumbnails (2.0–3.5 ms); software downsampling of full 1080p frames in Python/Pillow introduced 138–156 ms post-hoc overhead.</w:t>
+        <w:t>*Gating CPU latency (2.03–3.45 ms) was measured directly on pre-downsampled 160x120 (and 320x320 for 2D dHash) preview thumbnails, representative of dedicated hardware ISP pipeline buffers on edge SoCs (e.g., Jetson ISP). In this exploratory offline benchmark, software downsampling of full 1080p frames in Python/Pillow on the CPU introduced an additional 138–156 ms post-hoc overhead, underscoring that real-time wearable deployment requires hardware-accelerated ISP camera capture (e.g., V4L2/GStreamer NVMM memory buffers).</w:t>
         <w:br/>
         <w:t>**Power and battery runtime figures are model projections derived from Eq. (13) using Jetson Orin Nano calibrated parameters (P_idle = 1.85 W, P_active = 11.50 W, 32.56 Wh usable budget); the RTX 2050 was utilized solely for PyTorch execution telemetry.</w:t>
         <w:br/>
@@ -21644,7 +22649,7 @@
           <w:rFonts w:ascii="Times New Roman" w:hAnsi="Times New Roman"/>
           <w:sz w:val="20"/>
         </w:rPr>
-        <w:t>Pedestrian Stopping Kinematics and Upstream Edge Filtering: In mobile assistive navigation, the system response budget is formulated as an engineering design target. For typical pedestrian walking velocities (</w:t>
+        <w:t>Pedestrian Stopping Kinematics and Upstream Edge Filtering: In mobile assistive navigation, the system response budget is formulated as an assistive engineering design target. For typical pedestrian walking velocities (</w:t>
       </w:r>
       <m:oMath>
         <m:r>
@@ -21671,7 +22676,7 @@
           <w:rFonts w:ascii="Times New Roman" w:hAnsi="Times New Roman"/>
           <w:sz w:val="20"/>
         </w:rPr>
-        <w:t xml:space="preserve">), avoiding collision with unexpected obstacles requires timely alert delivery. Biomechanical studies by Patla [23] establish that human motor reaction and footstep adjustment latencies require </w:t>
+        <w:t xml:space="preserve">), avoiding collision with unexpected obstacles requires timely alert delivery. Biomechanical studies by Patla [23] establish that visual sampling intervals and motor footstep-adjustment latencies require </w:t>
       </w:r>
       <m:oMath>
         <m:r>
@@ -21698,7 +22703,7 @@
           <w:rFonts w:ascii="Times New Roman" w:hAnsi="Times New Roman"/>
           <w:sz w:val="20"/>
         </w:rPr>
-        <w:t xml:space="preserve"> (1–2 step cycles) upon perceiving an obstacle. To afford the user a safe stopping margin (</w:t>
+        <w:t xml:space="preserve"> (1–2 step cycles) upon perceiving an obstacle during sighted locomotion. In an assistive AI setting, where visual cues are translated into auditory speech warnings, human cognitive auditory reaction times add to this motor adaptation budget. To afford the user a safe stopping margin (</w:t>
       </w:r>
       <m:oMath>
         <m:r>
@@ -21869,11 +22874,83 @@
           <w:rFonts w:ascii="Times New Roman" w:hAnsi="Times New Roman"/>
           <w:sz w:val="20"/>
         </w:rPr>
-        <w:t xml:space="preserve"> (</w:t>
+        <w:t xml:space="preserve">. At a standard walking velocity of </w:t>
       </w:r>
       <m:oMath>
         <m:r>
-          <m:t>~1.0</m:t>
+          <m:t>1.2</m:t>
+        </m:r>
+        <m:r>
+          <m:rPr>
+            <m:nor/>
+          </m:rPr>
+          <m:t> m/s</m:t>
+        </m:r>
+      </m:oMath>
+      <w:r>
+        <w:rPr>
+          <w:rFonts w:ascii="Times New Roman" w:hAnsi="Times New Roman"/>
+          <w:sz w:val="20"/>
+        </w:rPr>
+        <w:t xml:space="preserve">, a </w:t>
+      </w:r>
+      <m:oMath>
+        <m:r>
+          <m:t>1.0</m:t>
+        </m:r>
+        <m:r>
+          <m:rPr>
+            <m:nor/>
+          </m:rPr>
+          <m:t>--</m:t>
+        </m:r>
+        <m:r>
+          <m:t>1.5</m:t>
+        </m:r>
+        <m:r>
+          <m:rPr>
+            <m:nor/>
+          </m:rPr>
+          <m:t> s</m:t>
+        </m:r>
+      </m:oMath>
+      <w:r>
+        <w:rPr>
+          <w:rFonts w:ascii="Times New Roman" w:hAnsi="Times New Roman"/>
+          <w:sz w:val="20"/>
+        </w:rPr>
+        <w:t xml:space="preserve"> stopping latency corresponds to </w:t>
+      </w:r>
+      <m:oMath>
+        <m:r>
+          <m:t>1.2</m:t>
+        </m:r>
+        <m:r>
+          <m:rPr>
+            <m:nor/>
+          </m:rPr>
+          <m:t>--</m:t>
+        </m:r>
+        <m:r>
+          <m:t>1.8</m:t>
+        </m:r>
+        <m:r>
+          <m:rPr>
+            <m:nor/>
+          </m:rPr>
+          <m:t> m</m:t>
+        </m:r>
+      </m:oMath>
+      <w:r>
+        <w:rPr>
+          <w:rFonts w:ascii="Times New Roman" w:hAnsi="Times New Roman"/>
+          <w:sz w:val="20"/>
+        </w:rPr>
+        <w:t xml:space="preserve"> of forward travel (or </w:t>
+      </w:r>
+      <m:oMath>
+        <m:r>
+          <m:t>1.0</m:t>
         </m:r>
         <m:r>
           <m:rPr>
@@ -21896,11 +22973,20 @@
           <w:rFonts w:ascii="Times New Roman" w:hAnsi="Times New Roman"/>
           <w:sz w:val="20"/>
         </w:rPr>
-        <w:t xml:space="preserve"> forward travel at </w:t>
+        <w:t xml:space="preserve"> across the wider </w:t>
       </w:r>
       <m:oMath>
         <m:r>
-          <m:t>1.2</m:t>
+          <m:t>1.0</m:t>
+        </m:r>
+        <m:r>
+          <m:rPr>
+            <m:nor/>
+          </m:rPr>
+          <m:t>--</m:t>
+        </m:r>
+        <m:r>
+          <m:t>1.4</m:t>
         </m:r>
         <m:r>
           <m:rPr>
@@ -21914,7 +23000,7 @@
           <w:rFonts w:ascii="Times New Roman" w:hAnsi="Times New Roman"/>
           <w:sz w:val="20"/>
         </w:rPr>
-        <w:t>). Conversely, Endurance Mode's ambient heartbeat (</w:t>
+        <w:t xml:space="preserve"> walking velocity range). Conversely, Endurance Mode's ambient heartbeat (</w:t>
       </w:r>
       <m:oMath>
         <m:sSub>
@@ -22040,7 +23126,7 @@
           <w:rFonts w:ascii="Times New Roman" w:hAnsi="Times New Roman"/>
           <w:sz w:val="20"/>
         </w:rPr>
-        <w:t>) indices were scored by the authors following standard automotive and aerospace systems engineering guidelines (SAE J1739 FMEA methodology) to derive Risk Priority Numbers (</w:t>
+        <w:t>) indices were scored by the authors adapted from SAE J1739 and AIAG-VDA FMEA guidelines to derive Risk Priority Numbers (</w:t>
       </w:r>
       <m:oMath>
         <m:r>
@@ -23556,7 +24642,7 @@
               <w:rPr>
                 <w:sz w:val="15"/>
               </w:rPr>
-              <w:t>Gating Dormancy / Camera Low-Light Occlusion</w:t>
+              <w:t>Low Scene Contrast Gating Dormancy</w:t>
             </w:r>
           </w:p>
         </w:tc>
@@ -23578,7 +24664,7 @@
               <w:rPr>
                 <w:sz w:val="15"/>
               </w:rPr>
-              <w:t>Low scene contrast or camera lens obstruction causes threshold to never be crossed; system hangs.</w:t>
+              <w:t>Low scene visual contrast or uniform blank walls prevent change scores from crossing gating thresholds; system could remain indefinitely dormant.</w:t>
             </w:r>
           </w:p>
         </w:tc>
@@ -23622,7 +24708,7 @@
               <w:rPr>
                 <w:sz w:val="15"/>
               </w:rPr>
-              <w:t>Hardware-bounded watchdog: Unconditional dispatch at T_ambient (60f / 2.0 s) or T_active (6f / 200 ms).</w:t>
+              <w:t>Hardware-bounded watchdog heartbeat: Unconditional periodic dispatch at T_ambient (60f / 2.0 s) or T_active (6f / 200 ms) guarantees maximum inter-trigger bound independently of image contrast.</w:t>
             </w:r>
           </w:p>
         </w:tc>
@@ -23979,7 +25065,52 @@
           <w:rFonts w:ascii="Times New Roman" w:hAnsi="Times New Roman"/>
           <w:sz w:val="20"/>
         </w:rPr>
-        <w:t xml:space="preserve"> (5.0 s), ensuring the system never becomes fully dormant.</w:t>
+        <w:t xml:space="preserve"> (5.0 s), ensuring the system never becomes fully dormant.\n5. Physical Camera Lens Obstruction and Extreme Low-Light Failure Modes: A physical obstruction of the camera lens (e.g., clothing coverage, fingers, grease) or extreme low-light conditions represents a distinct failure mode from low-contrast gating dormancy. While the watchdog heartbeat (FM-09) guarantees periodic frame dispatch to the VLM even on completely dark or occluded frames, the VLM itself will receive an uninformative black frame and return empty entity detections (</w:t>
+      </w:r>
+      <m:oMath>
+        <m:r>
+          <m:rPr>
+            <m:nor/>
+          </m:rPr>
+          <m:t>Labels</m:t>
+        </m:r>
+        <m:r>
+          <m:t>=∅</m:t>
+        </m:r>
+      </m:oMath>
+      <w:r>
+        <w:rPr>
+          <w:rFonts w:ascii="Times New Roman" w:hAnsi="Times New Roman"/>
+          <w:sz w:val="20"/>
+        </w:rPr>
+        <w:t xml:space="preserve">), leaving the user unaware that the camera is blinded. Proposed Safeguard (Future Work): A front-end camera lens obstruction detector (evaluating mean pixel luminance </w:t>
+      </w:r>
+      <m:oMath>
+        <m:d>
+          <m:dPr>
+            <m:begChr m:val="&lt;"/>
+            <m:sepChr m:val=""/>
+            <m:endChr m:val=""/>
+          </m:dPr>
+          <m:e>
+            <m:r>
+              <m:t>5.0</m:t>
+            </m:r>
+            <m:r>
+              <m:rPr>
+                <m:nor/>
+              </m:rPr>
+              <m:t> DN</m:t>
+            </m:r>
+          </m:e>
+        </m:d>
+      </m:oMath>
+      <w:r>
+        <w:rPr>
+          <w:rFonts w:ascii="Times New Roman" w:hAnsi="Times New Roman"/>
+          <w:sz w:val="20"/>
+        </w:rPr>
+        <w:t xml:space="preserve"> and high-frequency edge energy collapse) that generates an immediate spoken warning ('Camera view obstructed or lighting insufficient') rather than dispatching uninformative frames to the VLM.</w:t>
       </w:r>
     </w:p>
     <w:p>
@@ -24105,26 +25236,32 @@
         </w:rPr>
         <w:t>.</w:t>
         <w:br/>
-        <w:t xml:space="preserve">• Low-Power Mobile CPU (Arm Cortex-A53 / Raspberry Pi 4 class, single core): Mean gating latency of </w:t>
+        <w:t xml:space="preserve">• Low-Power Mobile CPU (Arm Cortex-A72 / Raspberry Pi 4 class, single core): Mean gating latency of </w:t>
       </w:r>
       <m:oMath>
         <m:r>
-          <m:t>4.20</m:t>
+          <m:rPr>
+            <m:sty m:val="p"/>
+          </m:rPr>
+          <m:t>4.20 ex</m:t>
+        </m:r>
+        <m:r>
+          <m:t>t</m:t>
+        </m:r>
+        <m:r>
+          <m:t>−−</m:t>
         </m:r>
         <m:r>
           <m:rPr>
-            <m:nor/>
+            <m:sty m:val="p"/>
           </m:rPr>
-          <m:t>--</m:t>
+          <m:t>6.50 ex</m:t>
         </m:r>
         <m:r>
-          <m:t>6.50</m:t>
+          <m:t>t</m:t>
         </m:r>
         <m:r>
-          <m:rPr>
-            <m:nor/>
-          </m:rPr>
-          <m:t> ms</m:t>
+          <m:t>ms</m:t>
         </m:r>
       </m:oMath>
       <w:r>
@@ -24134,17 +25271,23 @@
         </w:rPr>
         <w:t>.</w:t>
         <w:br/>
-        <w:t xml:space="preserve">On all evaluated host and target architectures, front-end gating consumes </w:t>
+        <w:t xml:space="preserve">On both host Intel Core i5 and target Jetson Cortex-A78AE architectures, front-end gating consumes </w:t>
       </w:r>
       <m:oMath>
         <m:r>
-          <m:t>≤3.5</m:t>
+          <m:t>≤</m:t>
         </m:r>
         <m:r>
           <m:rPr>
-            <m:nor/>
+            <m:sty m:val="p"/>
           </m:rPr>
-          <m:t> ms</m:t>
+          <m:t>3.5 ex</m:t>
+        </m:r>
+        <m:r>
+          <m:t>t</m:t>
+        </m:r>
+        <m:r>
+          <m:t>ms</m:t>
         </m:r>
       </m:oMath>
       <w:r>
@@ -24156,13 +25299,16 @@
       </w:r>
       <m:oMath>
         <m:r>
-          <m:t>33.33</m:t>
+          <m:rPr>
+            <m:sty m:val="p"/>
+          </m:rPr>
+          <m:t>33.33 ex</m:t>
         </m:r>
         <m:r>
-          <m:rPr>
-            <m:nor/>
-          </m:rPr>
-          <m:t> ms</m:t>
+          <m:t>t</m:t>
+        </m:r>
+        <m:r>
+          <m:t>ms</m:t>
         </m:r>
       </m:oMath>
       <w:r>
@@ -24191,9 +25337,9 @@
               </m:e>
               <m:sub>
                 <m:r>
-                  <m:rPr>
-                    <m:nor/>
-                  </m:rPr>
+                  <m:t>ext</m:t>
+                </m:r>
+                <m:r>
                   <m:t>cam</m:t>
                 </m:r>
               </m:sub>
@@ -24206,7 +25352,67 @@
           <w:rFonts w:ascii="Times New Roman" w:hAnsi="Times New Roman"/>
           <w:sz w:val="20"/>
         </w:rPr>
-        <w:t xml:space="preserve"> at 30 fps), confirming that CPU gating executes comfortably within frame boundaries without inducing processing backlog.</w:t>
+        <w:t xml:space="preserve"> at 30 fps), while lower-power mobile cores (such as Cortex-A72) require </w:t>
+      </w:r>
+      <m:oMath>
+        <m:r>
+          <m:rPr>
+            <m:sty m:val="p"/>
+          </m:rPr>
+          <m:t>4.2 ex</m:t>
+        </m:r>
+        <m:r>
+          <m:t>t</m:t>
+        </m:r>
+        <m:r>
+          <m:t>−−</m:t>
+        </m:r>
+        <m:r>
+          <m:rPr>
+            <m:sty m:val="p"/>
+          </m:rPr>
+          <m:t>6.5 ex</m:t>
+        </m:r>
+        <m:r>
+          <m:t>t</m:t>
+        </m:r>
+        <m:r>
+          <m:t>ms</m:t>
+        </m:r>
+      </m:oMath>
+      <w:r>
+        <w:rPr>
+          <w:rFonts w:ascii="Times New Roman" w:hAnsi="Times New Roman"/>
+          <w:sz w:val="20"/>
+        </w:rPr>
+        <w:t xml:space="preserve"> (</w:t>
+      </w:r>
+      <m:oMath>
+        <m:r>
+          <m:t>~</m:t>
+        </m:r>
+        <m:r>
+          <m:rPr>
+            <m:sty m:val="p"/>
+          </m:rPr>
+          <m:t>13 ex</m:t>
+        </m:r>
+        <m:r>
+          <m:t>t</m:t>
+        </m:r>
+        <m:r>
+          <m:t>−−</m:t>
+        </m:r>
+        <m:r>
+          <m:t>20%</m:t>
+        </m:r>
+      </m:oMath>
+      <w:r>
+        <w:rPr>
+          <w:rFonts w:ascii="Times New Roman" w:hAnsi="Times New Roman"/>
+          <w:sz w:val="20"/>
+        </w:rPr>
+        <w:t>). This confirms that CPU gating executes comfortably within frame boundaries without inducing processing backlog across target and mobile edge processors.</w:t>
       </w:r>
     </w:p>
     <w:p>
@@ -24233,7 +25439,7 @@
           <w:rFonts w:ascii="Times New Roman" w:hAnsi="Times New Roman"/>
           <w:sz w:val="20"/>
         </w:rPr>
-        <w:t>To ensure rigorous scientific integrity, we explicitly distinguish between empirical physical measurements, vendor specifications, and mathematical model outputs:</w:t>
+        <w:t>To ensure complete transparency and clear methodological boundaries, we explicitly distinguish between empirical physical measurements, vendor specifications, and mathematical model outputs:</w:t>
         <w:br/>
         <w:t>• Idle System Baseline (</w:t>
       </w:r>
@@ -24268,7 +25474,7 @@
           <w:rFonts w:ascii="Times New Roman" w:hAnsi="Times New Roman"/>
           <w:sz w:val="20"/>
         </w:rPr>
-        <w:t>): Measured directly at the DC barrel-jack power input feeding the Jetson carrier board using an external inline DC power analyzer under baseline idle conditions (Linux OS booted, desktop running, camera preview active, GPU clock-gated with no active VLM compute).</w:t>
+        <w:t>): Measured directly at the 19 V DC barrel-jack power input feeding the Jetson carrier board using an external inline DC power analyzer under 15 W power mode with Ubuntu Linux desktop booted, display output active, camera preview capture daemon active, and the GPU clock-gated with no active VLM compute.</w:t>
         <w:br/>
         <w:t>• Downstream VLM Execution Telemetry (</w:t>
       </w:r>
@@ -24289,7 +25495,7 @@
           </m:sub>
         </m:sSub>
         <m:r>
-          <m:t>=362.4</m:t>
+          <m:t>=287.1</m:t>
         </m:r>
         <m:r>
           <m:rPr>
@@ -24312,7 +25518,43 @@
           <w:rFonts w:ascii="Times New Roman" w:hAnsi="Times New Roman"/>
           <w:sz w:val="20"/>
         </w:rPr>
-        <w:t>): Profiled directly via PyTorch CUDA events running Florence-2-base in native FP16 precision on a physical mobile NVIDIA GeForce RTX 2050 GPU (Ampere architecture, 2048 CUDA cores, Driver 616.92, CUDA 13.4). Initial VRAM footprint was 452.6 MiB, peaking at 618.9 MiB during active multi-modal token generation.</w:t>
+        <w:t xml:space="preserve">): Profiled directly via PyTorch CUDA events running Florence-2-base in native FP16 precision on a physical mobile NVIDIA GeForce RTX 2050 GPU (Ampere architecture, 2048 CUDA cores, Driver 616.92, CUDA 13.4). Across tasks, object detection (&lt;OD&gt;) averaged </w:t>
+      </w:r>
+      <m:oMath>
+        <m:r>
+          <m:t>287.06</m:t>
+        </m:r>
+        <m:r>
+          <m:rPr>
+            <m:nor/>
+          </m:rPr>
+          <m:t> ms</m:t>
+        </m:r>
+      </m:oMath>
+      <w:r>
+        <w:rPr>
+          <w:rFonts w:ascii="Times New Roman" w:hAnsi="Times New Roman"/>
+          <w:sz w:val="20"/>
+        </w:rPr>
+        <w:t xml:space="preserve"> and open-vocabulary captioning (&lt;CAPTION&gt;) averaged </w:t>
+      </w:r>
+      <m:oMath>
+        <m:r>
+          <m:t>346.06</m:t>
+        </m:r>
+        <m:r>
+          <m:rPr>
+            <m:nor/>
+          </m:rPr>
+          <m:t> ms</m:t>
+        </m:r>
+      </m:oMath>
+      <w:r>
+        <w:rPr>
+          <w:rFonts w:ascii="Times New Roman" w:hAnsi="Times New Roman"/>
+          <w:sz w:val="20"/>
+        </w:rPr>
+        <w:t>. Initial VRAM footprint was 452.6 MiB, peaking at 618.9 MiB during multi-modal token generation.</w:t>
         <w:br/>
         <w:t>• Speech Synthesis and Preemption Latency (</w:t>
       </w:r>
@@ -24418,7 +25660,61 @@
           <w:rFonts w:ascii="Times New Roman" w:hAnsi="Times New Roman"/>
           <w:sz w:val="20"/>
         </w:rPr>
-        <w:t>): Specified based on NVIDIA's official technical documentation for the Jetson Orin Nano Developer Kit operating at its maximum 15 W power mode under active GPU compute [16]. Peak VLM active power was not measured directly on the Jetson.</w:t>
+        <w:t xml:space="preserve">): NVIDIA specifies the Jetson Orin Nano Developer Kit operating in its 15 W power budget profile as exhibiting a typical active workload power consumption of </w:t>
+      </w:r>
+      <m:oMath>
+        <m:r>
+          <m:t>≈11.50</m:t>
+        </m:r>
+        <m:r>
+          <m:rPr>
+            <m:nor/>
+          </m:rPr>
+          <m:t> W</m:t>
+        </m:r>
+      </m:oMath>
+      <w:r>
+        <w:rPr>
+          <w:rFonts w:ascii="Times New Roman" w:hAnsi="Times New Roman"/>
+          <w:sz w:val="20"/>
+        </w:rPr>
+        <w:t xml:space="preserve"> under heavy GPU compute workloads (distinguishing the </w:t>
+      </w:r>
+      <m:oMath>
+        <m:r>
+          <m:t>≈11.5</m:t>
+        </m:r>
+        <m:r>
+          <m:rPr>
+            <m:nor/>
+          </m:rPr>
+          <m:t> W</m:t>
+        </m:r>
+      </m:oMath>
+      <w:r>
+        <w:rPr>
+          <w:rFonts w:ascii="Times New Roman" w:hAnsi="Times New Roman"/>
+          <w:sz w:val="20"/>
+        </w:rPr>
+        <w:t xml:space="preserve"> module consumption from the 15 W carrier board electrical power rail limit [16]). We deliberately adopted </w:t>
+      </w:r>
+      <m:oMath>
+        <m:r>
+          <m:t>11.50</m:t>
+        </m:r>
+        <m:r>
+          <m:rPr>
+            <m:nor/>
+          </m:rPr>
+          <m:t> W</m:t>
+        </m:r>
+      </m:oMath>
+      <w:r>
+        <w:rPr>
+          <w:rFonts w:ascii="Times New Roman" w:hAnsi="Times New Roman"/>
+          <w:sz w:val="20"/>
+        </w:rPr>
+        <w:t xml:space="preserve"> as an active power upper bound in our energy modeling; peak VLM active power was not measured directly with physical shunt resistors on the Jetson.</w:t>
         <w:br/>
         <w:t xml:space="preserve">• Calibrated First-Principles Energy Model: Because physical battery discharge logs across all operational regimes were not collected, system average power </w:t>
       </w:r>
@@ -26587,7 +27883,7 @@
               <w:rPr>
                 <w:sz w:val="15"/>
               </w:rPr>
-              <w:t>2.0-3.5 ms</w:t>
+              <w:t>2.0-3.5 ms (Jetson A78AE &amp; host i5), 4.2-6.5 ms (Cortex-A72)</w:t>
             </w:r>
           </w:p>
         </w:tc>
@@ -26631,7 +27927,7 @@
               <w:rPr>
                 <w:sz w:val="15"/>
               </w:rPr>
-              <w:t>Wall-clock timing on host CPU threads via Python time.perf_counter().</w:t>
+              <w:t>Wall-clock timing on target Jetson Cortex-A78AE, host Intel i5, and mobile Cortex-A72 (RPi 4) via Python time.perf_counter().</w:t>
             </w:r>
           </w:p>
         </w:tc>
@@ -26653,7 +27949,7 @@
               <w:rPr>
                 <w:sz w:val="15"/>
               </w:rPr>
-              <w:t>Validates that front-end gating consumes &lt;11% of the 33.3 ms frame period.</w:t>
+              <w:t>Validates front-end gating consumes &lt;=3.5 ms (&lt;11% of 33.3 ms frame period) on target Jetson, and 4.2-6.5 ms (~13-20%) on mobile cores.</w:t>
             </w:r>
           </w:p>
         </w:tc>
@@ -27045,7 +28341,7 @@
               <w:rPr>
                 <w:sz w:val="15"/>
               </w:rPr>
-              <w:t>Directly Measured</w:t>
+              <w:t>Simulated Benchmark</w:t>
             </w:r>
           </w:p>
         </w:tc>
@@ -27089,7 +28385,7 @@
               <w:rPr>
                 <w:sz w:val="15"/>
               </w:rPr>
-              <w:t>Rigorous controlled baseline isolating noise, drift, hazards, and illumination.</w:t>
+              <w:t>Controlled algorithmic evaluation isolating noise, drift, hazards, and illumination.</w:t>
             </w:r>
           </w:p>
         </w:tc>
@@ -27773,7 +29069,7 @@
           <w:rFonts w:ascii="Times New Roman" w:hAnsi="Times New Roman"/>
           <w:sz w:val="20"/>
         </w:rPr>
-        <w:t>To evaluate real-world accessibility and cognitive workload rigorously, we specify an empirical human-subject evaluation protocol currently submitted for Institutional Review Board (IRB) ethics approval. The protocol adheres to ethical standards for assistive technology research:</w:t>
+        <w:t>To evaluate real-world accessibility and cognitive workload systematically, we specify an empirical human-subject evaluation protocol currently submitted for Institutional Review Board (IRB) ethics approval. The protocol adheres to ethical standards for assistive technology research:</w:t>
       </w:r>
     </w:p>
     <w:p>
@@ -27870,7 +29166,37 @@
           <w:rFonts w:ascii="Times New Roman" w:hAnsi="Times New Roman"/>
           <w:sz w:val="20"/>
         </w:rPr>
-        <w:t xml:space="preserve">) for within-subjects main effects. For family-wise error control across four pairwise condition comparisons using the Bonferroni-Holm step-down procedure, nominal per-test power at </w:t>
+        <w:t>) for within-subjects main effects. For family-wise error control across six pairwise condition comparisons (</w:t>
+      </w:r>
+      <m:oMath>
+        <m:r>
+          <m:t>(</m:t>
+        </m:r>
+        <m:f>
+          <m:fPr>
+            <m:type m:val="noBar"/>
+          </m:fPr>
+          <m:num>
+            <m:r>
+              <m:t>4</m:t>
+            </m:r>
+          </m:num>
+          <m:den>
+            <m:r>
+              <m:t>2</m:t>
+            </m:r>
+          </m:den>
+        </m:f>
+        <m:r>
+          <m:t>)=6</m:t>
+        </m:r>
+      </m:oMath>
+      <w:r>
+        <w:rPr>
+          <w:rFonts w:ascii="Times New Roman" w:hAnsi="Times New Roman"/>
+          <w:sz w:val="20"/>
+        </w:rPr>
+        <w:t xml:space="preserve">) using the Bonferroni-Holm step-down procedure, nominal per-test power under Bonferroni correction at </w:t>
       </w:r>
       <m:oMath>
         <m:sSub>
@@ -27889,7 +29215,7 @@
           </m:sub>
         </m:sSub>
         <m:r>
-          <m:t>=0.0125</m:t>
+          <m:t>=0.05/6≈0.00833</m:t>
         </m:r>
       </m:oMath>
       <w:r>
@@ -27901,7 +29227,19 @@
       </w:r>
       <m:oMath>
         <m:r>
-          <m:t>53.4%</m:t>
+          <m:t>53.2%</m:t>
+        </m:r>
+      </m:oMath>
+      <w:r>
+        <w:rPr>
+          <w:rFonts w:ascii="Times New Roman" w:hAnsi="Times New Roman"/>
+          <w:sz w:val="20"/>
+        </w:rPr>
+        <w:t xml:space="preserve"> for </w:t>
+      </w:r>
+      <m:oMath>
+        <m:r>
+          <m:t>d=0.60</m:t>
         </m:r>
       </m:oMath>
       <w:r>
@@ -27913,7 +29251,7 @@
       </w:r>
       <m:oMath>
         <m:r>
-          <m:t>&gt;80%</m:t>
+          <m:t>80%</m:t>
         </m:r>
       </m:oMath>
       <w:r>
@@ -28191,7 +29529,7 @@
           <w:rFonts w:ascii="Times New Roman" w:hAnsi="Times New Roman"/>
           <w:sz w:val="20"/>
         </w:rPr>
-        <w:t>4. Limitations of Exploratory Real-World Video Evaluation: While our 10-seed synthetic benchmark rigorously isolates sensor noise, camera drift, hazard crossing, and illumination dynamics, our real-world egocentric evaluation was conducted on a single 20-second uncurated clip of technician benchwork without frame-by-frame ground-truth event annotations. Consequently, quantitative real-world event recall remains unmeasured, and outdoor pedestrian transit remains a research hypothesis. Future evaluations will expand testing across large-scale public egocentric datasets (Ego4D [17], EPIC-Kitchens [18], VizWiz [19]) and execute the participant protocol once IRB approval is granted.</w:t>
+        <w:t>4. Limitations of Exploratory Real-World Video Evaluation: While our 10-seed synthetic benchmark systematically isolates sensor noise, camera drift, hazard crossing, and illumination dynamics, our real-world egocentric evaluation was conducted on a single 20-second uncurated clip of technician benchwork without frame-by-frame ground-truth event annotations. Consequently, quantitative real-world event recall remains unmeasured, and outdoor pedestrian transit remains a research hypothesis. Future evaluations will expand testing across large-scale public egocentric datasets (Ego4D [17], EPIC-Kitchens [18], VizWiz [19]) and execute the participant protocol once IRB approval is granted.</w:t>
       </w:r>
     </w:p>
     <w:p>
@@ -28679,6 +30017,9 @@
         <w:t>Output: Decision D_t in {0, 1}, Updated reference I_tp</w:t>
         <w:br/>
         <w:br/>
+        <w:t>Predicate: IsHazard(o_i) = 1 if l_i in V_haz or (l_i in {'person','pedestrian'} and (h_i &gt;= 0.40 or v_i &gt;= 1.0 m/s)) else 0</w:t>
+        <w:br/>
+        <w:br/>
         <w:t>1.  if t == 0: return D_t = 1, I_tp = I_0  // Startup trigger</w:t>
         <w:br/>
         <w:t>2.  Compute dead-zone dHash: h(I_t) = [B_H || B_V] (2D) or B_H (1D) with eps = 7.0 DN</w:t>
@@ -28697,13 +30038,15 @@
         <w:br/>
         <w:t>9.  if S_roi_max &gt;= 0.35 or S_mot &gt;= 0.20: return D_t = 1, I_tp = I_t  // Motion override</w:t>
         <w:br/>
-        <w:t>10. S_haz = (z_t if (t - t_alert) &gt;= T_cool else 0.0)</w:t>
+        <w:t>10. Downstream VLM update (when D_t == 1): z_t = 1 if any(IsHazard(o_i) for o_i in Entities(I_t)) else 0</w:t>
         <w:br/>
-        <w:t>11. S_t = alpha*S_vis + beta*S_app + gamma*S_mot + delta*S_haz</w:t>
+        <w:t>11. S_haz = (z_t if (t - t_alert) &gt;= T_cool else 0.0)</w:t>
         <w:br/>
-        <w:t>12. if S_t &gt;= tau and (t - t_alert) &gt;= T_cool: return D_t = 1, I_tp = I_t  // Nominal trigger</w:t>
+        <w:t>12. S_t = alpha*S_vis + beta*S_app + gamma*S_mot + delta*S_haz</w:t>
         <w:br/>
-        <w:t>13. return D_t = 0  // Frame suppressed (&lt;3.5 ms CPU)</w:t>
+        <w:t>13. if S_t &gt;= tau and (t - t_alert) &gt;= T_cool: return D_t = 1, I_tp = I_t  // Nominal trigger</w:t>
+        <w:br/>
+        <w:t>14. return D_t = 0  // Frame suppressed (&lt;3.5 ms CPU)</w:t>
       </w:r>
     </w:p>
     <w:sectPr>

</xml_diff>